<commit_message>
Documentation revision: k/N notation explained, more technical prose
New section 1.5 (notation): cell definition, k/N read as numerator/
denominator with an explicit 0/200 = zero violations in 200 responses
example, Wilson 95 percent formula with the 1.88/3.70 percent upper
bounds. Results table now shows k / N (rate) with a reading guide;
all bare 0/200 spellings normalized to 0 / 200.

Technical depth: call-time enum JSON schema fragment, Tier B
verification loop pseudocode (retry/strip/flag), sample JSONL run
record with field-by-field reading, glossary entries for k/N and cell.
</commit_message>
<xml_diff>
--- a/docs/mlcompass_Teknik_Dokumantasyon.docx
+++ b/docs/mlcompass_Teknik_Dokumantasyon.docx
@@ -195,7 +195,7 @@
         <w:spacing w:after="120"/>
       </w:pPr>
       <w:r>
-        <w:t xml:space="preserve">Bu üç kanal, bu projenin ölçüm ve doğrulama nesnesidir. Haziran 2026 canlı ölçümlerinde çıplak (kural belirtilmemiş) bir anlatıcının sentetik görevde yanıtların yüzde 11.5-15’inde, gerçek veri görevinde ise yüzde 43.5’inde kanıt dışı sütun uydurduğu; üstelik aynı görevin altı farklı, kural içermeyen sistem-prompt parafrazı arasında bu oranın yüzde 1 ile yüzde 100 arasında oynadığı ölçüldü. Yani problem gerçek, büyük ve prompt seçimine aşırı duyarlı.</w:t>
+        <w:t xml:space="preserve">Bu üç kanal, bu projenin ölçüm ve doğrulama nesnesidir. Haziran 2026 canlı ölçümlerinde çıplak (kural belirtilmemiş) bir anlatıcının sentetik görevde 200 bağımsız yanıtın 23-30’unda (%11.5-15.0), gerçek veri görevinde ise 87’sinde (%43.5) kanıt dışı sütun uydurduğu; üstelik aynı görevin altı farklı, kural içermeyen sistem-prompt parafrazı arasında bu oranın %1 ile %100 arasında oynadığı ölçüldü (ölçüm birimleri ve k / N gösterimi için bkz. bölüm 1.5). Yani problem gerçek, büyük ve prompt seçimine aşırı duyarlı.</w:t>
       </w:r>
     </w:p>
     <w:p>
@@ -314,6 +314,59 @@
       </w:pPr>
       <w:r>
         <w:t xml:space="preserve">Bu belge, 7 Temmuz 2026 akşamı itibarıyla yapılan her şeyi tek yerde toplar: ürünün ne olduğu, kontrat mekanizmasının nasıl çalıştığı, ölçüm altyapısının (harness) tasarımı, FabBench benchmark’ı, Haziran ölçüm sonuçları, bilimsel süreç ve Q1 yol haritası, ön-kayıt disiplini, hakem paneli ve panel-onarım kod dalgaları, güncel durum ve sıradaki adımlar. Okuyucunun projeyi hiç bilmediği varsayılmıştır.</w:t>
+      </w:r>
+    </w:p>
+    <w:p>
+      <w:pPr>
+        <w:pStyle w:val="Heading2"/>
+      </w:pPr>
+      <w:r>
+        <w:t xml:space="preserve">1.5 Gösterim (notasyon)</w:t>
+      </w:r>
+    </w:p>
+    <w:p>
+      <w:pPr>
+        <w:spacing w:after="120"/>
+      </w:pPr>
+      <w:r>
+        <w:rPr>
+          <w:b/>
+          <w:bCs/>
+        </w:rPr>
+        <w:t xml:space="preserve">Hücre: </w:t>
+      </w:r>
+      <w:r>
+        <w:t xml:space="preserve">bu belgedeki her ölçüm birimi bir “hücre”dir: (sağlayıcı, model, görev, deney kolu, N, seed, kanıt-hash) yedilisi. Bir hücredeki tüm yanıtlar aynı kanıt sözlüğünden, aynı konfigürasyonla, bağımsız API çağrılarıyla örneklenir.</w:t>
+      </w:r>
+    </w:p>
+    <w:p>
+      <w:pPr>
+        <w:spacing w:after="120"/>
+      </w:pPr>
+      <w:r>
+        <w:rPr>
+          <w:b/>
+          <w:bCs/>
+        </w:rPr>
+        <w:t xml:space="preserve">k / N gösterimi: </w:t>
+      </w:r>
+      <w:r>
+        <w:t xml:space="preserve">hücrede örneklenen N bağımsız yanıtın k tanesinin ilgili kanalda ihlal içerdiği anlamına gelir; pay/payda ayracıdır, tek bir sayı değildir. Örnek: 0 / 200 = “200 yanıtın sıfırında ihlal gözlendi” (iki yüz yanıt; 2000 ile ilgisi yoktur). N, hücre başına örneklem büyüklüğüdür ve ön-kayıtta sabitlenir: çıkarımsal hücrelerde N=200, betimsel hücrelerde N=100 (A3.7).</w:t>
+      </w:r>
+    </w:p>
+    <w:p>
+      <w:pPr>
+        <w:spacing w:after="120"/>
+      </w:pPr>
+      <w:r>
+        <w:rPr>
+          <w:b/>
+          <w:bCs/>
+        </w:rPr>
+        <w:t xml:space="preserve">Wilson %95 güven aralığı: </w:t>
+      </w:r>
+      <w:r>
+        <w:t xml:space="preserve">k / N oranının örnekleme belirsizliği Wilson skor aralığıyla verilir: merkez = (p̂ + z²/2N) / (1 + z²/N), yarı-genişlik = (z / (1 + z²/N)) · sqrt(p̂(1-p̂)/N + z²/4N²), z = 1.959964. Kritik sonuç: k = 0 gözlemi “kesin sıfır” kanıtı DEĞİLDİR; 0 / 200 gözlemi %1.88, 0 / 100 gözlemi %3.70 üst sınır bırakır. Bu yüzden makaledeki her sıfır iddiası hücre bazında Wilson üst sınırıyla birlikte raporlanır (A3.12).</w:t>
       </w:r>
     </w:p>
     <w:p>
@@ -1988,7 +2041,210 @@
         <w:t xml:space="preserve">claims[].column.enum</w:t>
       </w:r>
       <w:r>
-        <w:t xml:space="preserve"> alanları bu listeye eşitlenir. Ayrıca verdict (leakage_likely / leakage_uncertain / score_legitimate / cannot_determine) ve confidence (high / medium / low / cannot_determine) alanları sabit enum’dur. Model, cevabını bu araca zorunlu tool_choice ile vermek zorundadır.</w:t>
+        <w:t xml:space="preserve"> alanları bu listeye eşitlenir. Ayrıca verdict (leakage_likely / leakage_uncertain / score_legitimate / cannot_determine) ve confidence (high / medium / low / cannot_determine) alanları sabit enum’dur. Model, cevabını bu araca zorunlu tool_choice ile vermek zorundadır (Anthropic formatında {type: "tool", name: ...}; OpenAI formatında tool_choice: "required").</w:t>
+      </w:r>
+    </w:p>
+    <w:p>
+      <w:pPr>
+        <w:spacing w:after="120"/>
+      </w:pPr>
+      <w:r>
+        <w:t xml:space="preserve">Kanıtta üç öznitelik raporlanmışken üretilen şemanın ilgili parçası:</w:t>
+      </w:r>
+    </w:p>
+    <w:p>
+      <w:pPr>
+        <w:shd w:fill="F2F2F2" w:val="clear"/>
+        <w:spacing w:after="0"/>
+        <w:ind w:left="240" w:right="240"/>
+      </w:pPr>
+      <w:r>
+        <w:rPr>
+          <w:rFonts w:ascii="Consolas" w:cs="Consolas" w:eastAsia="Consolas" w:hAnsi="Consolas"/>
+          <w:sz w:val="18"/>
+          <w:szCs w:val="18"/>
+        </w:rPr>
+        <w:t xml:space="preserve">"columns_referenced": {</w:t>
+      </w:r>
+    </w:p>
+    <w:p>
+      <w:pPr>
+        <w:shd w:fill="F2F2F2" w:val="clear"/>
+        <w:spacing w:after="0"/>
+        <w:ind w:left="240" w:right="240"/>
+      </w:pPr>
+      <w:r>
+        <w:rPr>
+          <w:rFonts w:ascii="Consolas" w:cs="Consolas" w:eastAsia="Consolas" w:hAnsi="Consolas"/>
+          <w:sz w:val="18"/>
+          <w:szCs w:val="18"/>
+        </w:rPr>
+        <w:t xml:space="preserve">  "type": "array",</w:t>
+      </w:r>
+    </w:p>
+    <w:p>
+      <w:pPr>
+        <w:shd w:fill="F2F2F2" w:val="clear"/>
+        <w:spacing w:after="0"/>
+        <w:ind w:left="240" w:right="240"/>
+      </w:pPr>
+      <w:r>
+        <w:rPr>
+          <w:rFonts w:ascii="Consolas" w:cs="Consolas" w:eastAsia="Consolas" w:hAnsi="Consolas"/>
+          <w:sz w:val="18"/>
+          <w:szCs w:val="18"/>
+        </w:rPr>
+        <w:t xml:space="preserve">  "items": { "type": "string",</w:t>
+      </w:r>
+    </w:p>
+    <w:p>
+      <w:pPr>
+        <w:shd w:fill="F2F2F2" w:val="clear"/>
+        <w:spacing w:after="0"/>
+        <w:ind w:left="240" w:right="240"/>
+      </w:pPr>
+      <w:r>
+        <w:rPr>
+          <w:rFonts w:ascii="Consolas" w:cs="Consolas" w:eastAsia="Consolas" w:hAnsi="Consolas"/>
+          <w:sz w:val="18"/>
+          <w:szCs w:val="18"/>
+        </w:rPr>
+        <w:t xml:space="preserve">    "enum": ["feature_3", "log_target_v2", "near_target_proxy"] }</w:t>
+      </w:r>
+    </w:p>
+    <w:p>
+      <w:pPr>
+        <w:shd w:fill="F2F2F2" w:val="clear"/>
+        <w:spacing w:after="0"/>
+        <w:ind w:left="240" w:right="240"/>
+      </w:pPr>
+      <w:r>
+        <w:rPr>
+          <w:rFonts w:ascii="Consolas" w:cs="Consolas" w:eastAsia="Consolas" w:hAnsi="Consolas"/>
+          <w:sz w:val="18"/>
+          <w:szCs w:val="18"/>
+        </w:rPr>
+        <w:t xml:space="preserve">},</w:t>
+      </w:r>
+    </w:p>
+    <w:p>
+      <w:pPr>
+        <w:shd w:fill="F2F2F2" w:val="clear"/>
+        <w:spacing w:after="0"/>
+        <w:ind w:left="240" w:right="240"/>
+      </w:pPr>
+      <w:r>
+        <w:rPr>
+          <w:rFonts w:ascii="Consolas" w:cs="Consolas" w:eastAsia="Consolas" w:hAnsi="Consolas"/>
+          <w:sz w:val="18"/>
+          <w:szCs w:val="18"/>
+        </w:rPr>
+        <w:t xml:space="preserve">"claims": {</w:t>
+      </w:r>
+    </w:p>
+    <w:p>
+      <w:pPr>
+        <w:shd w:fill="F2F2F2" w:val="clear"/>
+        <w:spacing w:after="0"/>
+        <w:ind w:left="240" w:right="240"/>
+      </w:pPr>
+      <w:r>
+        <w:rPr>
+          <w:rFonts w:ascii="Consolas" w:cs="Consolas" w:eastAsia="Consolas" w:hAnsi="Consolas"/>
+          <w:sz w:val="18"/>
+          <w:szCs w:val="18"/>
+        </w:rPr>
+        <w:t xml:space="preserve">  "type": "array",</w:t>
+      </w:r>
+    </w:p>
+    <w:p>
+      <w:pPr>
+        <w:shd w:fill="F2F2F2" w:val="clear"/>
+        <w:spacing w:after="0"/>
+        <w:ind w:left="240" w:right="240"/>
+      </w:pPr>
+      <w:r>
+        <w:rPr>
+          <w:rFonts w:ascii="Consolas" w:cs="Consolas" w:eastAsia="Consolas" w:hAnsi="Consolas"/>
+          <w:sz w:val="18"/>
+          <w:szCs w:val="18"/>
+        </w:rPr>
+        <w:t xml:space="preserve">  "items": { "type": "object", "properties": {</w:t>
+      </w:r>
+    </w:p>
+    <w:p>
+      <w:pPr>
+        <w:shd w:fill="F2F2F2" w:val="clear"/>
+        <w:spacing w:after="0"/>
+        <w:ind w:left="240" w:right="240"/>
+      </w:pPr>
+      <w:r>
+        <w:rPr>
+          <w:rFonts w:ascii="Consolas" w:cs="Consolas" w:eastAsia="Consolas" w:hAnsi="Consolas"/>
+          <w:sz w:val="18"/>
+          <w:szCs w:val="18"/>
+        </w:rPr>
+        <w:t xml:space="preserve">      "column":    { "type": "string", "enum": [ /* ayni liste */ ] },</w:t>
+      </w:r>
+    </w:p>
+    <w:p>
+      <w:pPr>
+        <w:shd w:fill="F2F2F2" w:val="clear"/>
+        <w:spacing w:after="0"/>
+        <w:ind w:left="240" w:right="240"/>
+      </w:pPr>
+      <w:r>
+        <w:rPr>
+          <w:rFonts w:ascii="Consolas" w:cs="Consolas" w:eastAsia="Consolas" w:hAnsi="Consolas"/>
+          <w:sz w:val="18"/>
+          <w:szCs w:val="18"/>
+        </w:rPr>
+        <w:t xml:space="preserve">      "statistic": { "type": "string", "enum": ["correlation"] },</w:t>
+      </w:r>
+    </w:p>
+    <w:p>
+      <w:pPr>
+        <w:shd w:fill="F2F2F2" w:val="clear"/>
+        <w:spacing w:after="0"/>
+        <w:ind w:left="240" w:right="240"/>
+      </w:pPr>
+      <w:r>
+        <w:rPr>
+          <w:rFonts w:ascii="Consolas" w:cs="Consolas" w:eastAsia="Consolas" w:hAnsi="Consolas"/>
+          <w:sz w:val="18"/>
+          <w:szCs w:val="18"/>
+        </w:rPr>
+        <w:t xml:space="preserve">      "value":     { "type": "number" } },</w:t>
+      </w:r>
+    </w:p>
+    <w:p>
+      <w:pPr>
+        <w:shd w:fill="F2F2F2" w:val="clear"/>
+        <w:spacing w:after="0"/>
+        <w:ind w:left="240" w:right="240"/>
+      </w:pPr>
+      <w:r>
+        <w:rPr>
+          <w:rFonts w:ascii="Consolas" w:cs="Consolas" w:eastAsia="Consolas" w:hAnsi="Consolas"/>
+          <w:sz w:val="18"/>
+          <w:szCs w:val="18"/>
+        </w:rPr>
+        <w:t xml:space="preserve">    "required": ["column", "statistic", "value"] }</w:t>
+      </w:r>
+    </w:p>
+    <w:p>
+      <w:pPr>
+        <w:shd w:fill="F2F2F2" w:val="clear"/>
+        <w:spacing w:after="160"/>
+        <w:ind w:left="240" w:right="240"/>
+      </w:pPr>
+      <w:r>
+        <w:rPr>
+          <w:rFonts w:ascii="Consolas" w:cs="Consolas" w:eastAsia="Consolas" w:hAnsi="Consolas"/>
+          <w:sz w:val="18"/>
+          <w:szCs w:val="18"/>
+        </w:rPr>
+        <w:t xml:space="preserve">}</w:t>
       </w:r>
     </w:p>
     <w:p>
@@ -2463,7 +2719,210 @@
         <w:t xml:space="preserve">Önerme 2 (omisyon bayrağı): </w:t>
       </w:r>
       <w:r>
-        <w:t xml:space="preserve">eksik bırakma silinerek onarılamaz (bir şeyi silmek, söylenmemiş olanı söyletmez); bu yüzden kalıcı omisyon bayraklanır ve bayrak kullanıcıya giden çıktının parçasıdır. Silme sonrası yeniden kontrol vardır: değer ihlali silinince çapa artık anılmıyorsa bayrak yine kalkar (post-strip recheck).</w:t>
+        <w:t xml:space="preserve">eksik bırakma silinerek onarılamaz (bir şeyi silmek, söylenmemiş olanı söyletmez); bu yüzden kalıcı omisyon bayraklanır ve bayrak kullanıcıya giden çıktının parçasıdır. Silme sonrası yeniden kontrol vardır: değer ihlali silinince çapa artık anılmıyorsa omisyon bayrağı yeniden değerlendirilir (post-strip recheck).</w:t>
+      </w:r>
+    </w:p>
+    <w:p>
+      <w:pPr>
+        <w:spacing w:after="120"/>
+      </w:pPr>
+      <w:r>
+        <w:t xml:space="preserve">Doğrulama döngüsünün sadeleştirilmiş kontrol akışı:</w:t>
+      </w:r>
+    </w:p>
+    <w:p>
+      <w:pPr>
+        <w:shd w:fill="F2F2F2" w:val="clear"/>
+        <w:spacing w:after="0"/>
+        <w:ind w:left="240" w:right="240"/>
+      </w:pPr>
+      <w:r>
+        <w:rPr>
+          <w:rFonts w:ascii="Consolas" w:cs="Consolas" w:eastAsia="Consolas" w:hAnsi="Consolas"/>
+          <w:sz w:val="18"/>
+          <w:szCs w:val="18"/>
+        </w:rPr>
+        <w:t xml:space="preserve">for attempt in 0 .. max_retries:</w:t>
+      </w:r>
+    </w:p>
+    <w:p>
+      <w:pPr>
+        <w:shd w:fill="F2F2F2" w:val="clear"/>
+        <w:spacing w:after="0"/>
+        <w:ind w:left="240" w:right="240"/>
+      </w:pPr>
+      <w:r>
+        <w:rPr>
+          <w:rFonts w:ascii="Consolas" w:cs="Consolas" w:eastAsia="Consolas" w:hAnsi="Consolas"/>
+          <w:sz w:val="18"/>
+          <w:szCs w:val="18"/>
+        </w:rPr>
+        <w:t xml:space="preserve">    yanit = saglayici_cagrisi(system, user + duzeltme, tool)  # zorunlu tool_choice</w:t>
+      </w:r>
+    </w:p>
+    <w:p>
+      <w:pPr>
+        <w:shd w:fill="F2F2F2" w:val="clear"/>
+        <w:spacing w:after="0"/>
+        <w:ind w:left="240" w:right="240"/>
+      </w:pPr>
+      <w:r>
+        <w:rPr>
+          <w:rFonts w:ascii="Consolas" w:cs="Consolas" w:eastAsia="Consolas" w:hAnsi="Consolas"/>
+          <w:sz w:val="18"/>
+          <w:szCs w:val="18"/>
+        </w:rPr>
+        <w:t xml:space="preserve">    E = { c in columns_referenced : c izinli kumede degil }   # varlik ihlalleri</w:t>
+      </w:r>
+    </w:p>
+    <w:p>
+      <w:pPr>
+        <w:shd w:fill="F2F2F2" w:val="clear"/>
+        <w:spacing w:after="0"/>
+        <w:ind w:left="240" w:right="240"/>
+      </w:pPr>
+      <w:r>
+        <w:rPr>
+          <w:rFonts w:ascii="Consolas" w:cs="Consolas" w:eastAsia="Consolas" w:hAnsi="Consolas"/>
+          <w:sz w:val="18"/>
+          <w:szCs w:val="18"/>
+        </w:rPr>
+        <w:t xml:space="preserve">    V = { iddia : column kanit disi  VEYA  |value - corr[column]| &gt; 0.005 }</w:t>
+      </w:r>
+    </w:p>
+    <w:p>
+      <w:pPr>
+        <w:shd w:fill="F2F2F2" w:val="clear"/>
+        <w:spacing w:after="0"/>
+        <w:ind w:left="240" w:right="240"/>
+      </w:pPr>
+      <w:r>
+        <w:rPr>
+          <w:rFonts w:ascii="Consolas" w:cs="Consolas" w:eastAsia="Consolas" w:hAnsi="Consolas"/>
+          <w:sz w:val="18"/>
+          <w:szCs w:val="18"/>
+        </w:rPr>
+        <w:t xml:space="preserve">    O = (verdict hukum iceriyor) VE (capa ne atifta ne iddiada)</w:t>
+      </w:r>
+    </w:p>
+    <w:p>
+      <w:pPr>
+        <w:shd w:fill="F2F2F2" w:val="clear"/>
+        <w:spacing w:after="0"/>
+        <w:ind w:left="240" w:right="240"/>
+      </w:pPr>
+      <w:r>
+        <w:rPr>
+          <w:rFonts w:ascii="Consolas" w:cs="Consolas" w:eastAsia="Consolas" w:hAnsi="Consolas"/>
+          <w:sz w:val="18"/>
+          <w:szCs w:val="18"/>
+        </w:rPr>
+        <w:t xml:space="preserve">    if E bos VE V bos VE O yanlis: break                      # temiz yanit</w:t>
+      </w:r>
+    </w:p>
+    <w:p>
+      <w:pPr>
+        <w:shd w:fill="F2F2F2" w:val="clear"/>
+        <w:spacing w:after="0"/>
+        <w:ind w:left="240" w:right="240"/>
+      </w:pPr>
+      <w:r>
+        <w:rPr>
+          <w:rFonts w:ascii="Consolas" w:cs="Consolas" w:eastAsia="Consolas" w:hAnsi="Consolas"/>
+          <w:sz w:val="18"/>
+          <w:szCs w:val="18"/>
+        </w:rPr>
+        <w:t xml:space="preserve">    schema_rejections += 1;  rejection_kinds.append(E/V/O bilesimi)</w:t>
+      </w:r>
+    </w:p>
+    <w:p>
+      <w:pPr>
+        <w:shd w:fill="F2F2F2" w:val="clear"/>
+        <w:spacing w:after="0"/>
+        <w:ind w:left="240" w:right="240"/>
+      </w:pPr>
+      <w:r>
+        <w:rPr>
+          <w:rFonts w:ascii="Consolas" w:cs="Consolas" w:eastAsia="Consolas" w:hAnsi="Consolas"/>
+          <w:sz w:val="18"/>
+          <w:szCs w:val="18"/>
+        </w:rPr>
+        <w:t xml:space="preserve">    duzeltme = ihlalleri ADIYLA sayan mesaj   # correction_style=generic: icerik yok</w:t>
+      </w:r>
+    </w:p>
+    <w:p>
+      <w:pPr>
+        <w:shd w:fill="F2F2F2" w:val="clear"/>
+        <w:spacing w:after="0"/>
+        <w:ind w:left="240" w:right="240"/>
+      </w:pPr>
+      <w:r>
+        <w:rPr>
+          <w:rFonts w:ascii="Consolas" w:cs="Consolas" w:eastAsia="Consolas" w:hAnsi="Consolas"/>
+          <w:sz w:val="18"/>
+          <w:szCs w:val="18"/>
+        </w:rPr>
+        <w:t xml:space="preserve"> </w:t>
+      </w:r>
+    </w:p>
+    <w:p>
+      <w:pPr>
+        <w:shd w:fill="F2F2F2" w:val="clear"/>
+        <w:spacing w:after="0"/>
+        <w:ind w:left="240" w:right="240"/>
+      </w:pPr>
+      <w:r>
+        <w:rPr>
+          <w:rFonts w:ascii="Consolas" w:cs="Consolas" w:eastAsia="Consolas" w:hAnsi="Consolas"/>
+          <w:sz w:val="18"/>
+          <w:szCs w:val="18"/>
+        </w:rPr>
+        <w:t xml:space="preserve"># retry butcesi bitti -&gt; deterministik son islem:</w:t>
+      </w:r>
+    </w:p>
+    <w:p>
+      <w:pPr>
+        <w:shd w:fill="F2F2F2" w:val="clear"/>
+        <w:spacing w:after="0"/>
+        <w:ind w:left="240" w:right="240"/>
+      </w:pPr>
+      <w:r>
+        <w:rPr>
+          <w:rFonts w:ascii="Consolas" w:cs="Consolas" w:eastAsia="Consolas" w:hAnsi="Consolas"/>
+          <w:sz w:val="18"/>
+          <w:szCs w:val="18"/>
+        </w:rPr>
+        <w:t xml:space="preserve">columns_referenced = [c for c in columns_referenced if c izinli]   # strip (Onerme 1)</w:t>
+      </w:r>
+    </w:p>
+    <w:p>
+      <w:pPr>
+        <w:shd w:fill="F2F2F2" w:val="clear"/>
+        <w:spacing w:after="0"/>
+        <w:ind w:left="240" w:right="240"/>
+      </w:pPr>
+      <w:r>
+        <w:rPr>
+          <w:rFonts w:ascii="Consolas" w:cs="Consolas" w:eastAsia="Consolas" w:hAnsi="Consolas"/>
+          <w:sz w:val="18"/>
+          <w:szCs w:val="18"/>
+        </w:rPr>
+        <w:t xml:space="preserve">claims             = [i for i in claims if deger toleransta]       # strip (Onerme 1)</w:t>
+      </w:r>
+    </w:p>
+    <w:p>
+      <w:pPr>
+        <w:shd w:fill="F2F2F2" w:val="clear"/>
+        <w:spacing w:after="160"/>
+        <w:ind w:left="240" w:right="240"/>
+      </w:pPr>
+      <w:r>
+        <w:rPr>
+          <w:rFonts w:ascii="Consolas" w:cs="Consolas" w:eastAsia="Consolas" w:hAnsi="Consolas"/>
+          <w:sz w:val="18"/>
+          <w:szCs w:val="18"/>
+        </w:rPr>
+        <w:t xml:space="preserve">omitted_critical_evidence = O(post-strip alanlar uzerinden)        # flag  (Onerme 2)</w:t>
       </w:r>
     </w:p>
     <w:p>
@@ -4607,6 +5066,138 @@
       </w:r>
       <w:r>
         <w:t xml:space="preserve">her kayıtta provider / task / seed / evidence_hash / arm / model alanları vardır; tablo üreticileri dosya adı ayrıştırmaz. Kanıt sözlüğü de evidence_&lt;hash&gt;.json olarak logların yanına dökülür.</w:t>
+      </w:r>
+    </w:p>
+    <w:p>
+      <w:pPr>
+        <w:spacing w:after="120"/>
+      </w:pPr>
+      <w:r>
+        <w:t xml:space="preserve">Örnek JSONL kaydı (tek satır; okunabilirlik için kırılmış):</w:t>
+      </w:r>
+    </w:p>
+    <w:p>
+      <w:pPr>
+        <w:shd w:fill="F2F2F2" w:val="clear"/>
+        <w:spacing w:after="0"/>
+        <w:ind w:left="240" w:right="240"/>
+      </w:pPr>
+      <w:r>
+        <w:rPr>
+          <w:rFonts w:ascii="Consolas" w:cs="Consolas" w:eastAsia="Consolas" w:hAnsi="Consolas"/>
+          <w:sz w:val="18"/>
+          <w:szCs w:val="18"/>
+        </w:rPr>
+        <w:t xml:space="preserve">{"provider":"deepseek","task":"synthetic","seed":0,"evidence_hash":"a1b2c3d4",</w:t>
+      </w:r>
+    </w:p>
+    <w:p>
+      <w:pPr>
+        <w:shd w:fill="F2F2F2" w:val="clear"/>
+        <w:spacing w:after="0"/>
+        <w:ind w:left="240" w:right="240"/>
+      </w:pPr>
+      <w:r>
+        <w:rPr>
+          <w:rFonts w:ascii="Consolas" w:cs="Consolas" w:eastAsia="Consolas" w:hAnsi="Consolas"/>
+          <w:sz w:val="18"/>
+          <w:szCs w:val="18"/>
+        </w:rPr>
+        <w:t xml:space="preserve"> "i":17,"arm":"layer3_stress","model":"deepseek-v4-flash",</w:t>
+      </w:r>
+    </w:p>
+    <w:p>
+      <w:pPr>
+        <w:shd w:fill="F2F2F2" w:val="clear"/>
+        <w:spacing w:after="0"/>
+        <w:ind w:left="240" w:right="240"/>
+      </w:pPr>
+      <w:r>
+        <w:rPr>
+          <w:rFonts w:ascii="Consolas" w:cs="Consolas" w:eastAsia="Consolas" w:hAnsi="Consolas"/>
+          <w:sz w:val="18"/>
+          <w:szCs w:val="18"/>
+        </w:rPr>
+        <w:t xml:space="preserve"> "columns":["log_target_v2"],"claims":[],"verdict":"leakage_likely",</w:t>
+      </w:r>
+    </w:p>
+    <w:p>
+      <w:pPr>
+        <w:shd w:fill="F2F2F2" w:val="clear"/>
+        <w:spacing w:after="0"/>
+        <w:ind w:left="240" w:right="240"/>
+      </w:pPr>
+      <w:r>
+        <w:rPr>
+          <w:rFonts w:ascii="Consolas" w:cs="Consolas" w:eastAsia="Consolas" w:hAnsi="Consolas"/>
+          <w:sz w:val="18"/>
+          <w:szCs w:val="18"/>
+        </w:rPr>
+        <w:t xml:space="preserve"> "rejections":1,"rejection_kinds":["entity"],</w:t>
+      </w:r>
+    </w:p>
+    <w:p>
+      <w:pPr>
+        <w:shd w:fill="F2F2F2" w:val="clear"/>
+        <w:spacing w:after="0"/>
+        <w:ind w:left="240" w:right="240"/>
+      </w:pPr>
+      <w:r>
+        <w:rPr>
+          <w:rFonts w:ascii="Consolas" w:cs="Consolas" w:eastAsia="Consolas" w:hAnsi="Consolas"/>
+          <w:sz w:val="18"/>
+          <w:szCs w:val="18"/>
+        </w:rPr>
+        <w:t xml:space="preserve"> "sampling":{"temperature":1.0},</w:t>
+      </w:r>
+    </w:p>
+    <w:p>
+      <w:pPr>
+        <w:shd w:fill="F2F2F2" w:val="clear"/>
+        <w:spacing w:after="0"/>
+        <w:ind w:left="240" w:right="240"/>
+      </w:pPr>
+      <w:r>
+        <w:rPr>
+          <w:rFonts w:ascii="Consolas" w:cs="Consolas" w:eastAsia="Consolas" w:hAnsi="Consolas"/>
+          <w:sz w:val="18"/>
+          <w:szCs w:val="18"/>
+        </w:rPr>
+        <w:t xml:space="preserve"> "usage_in":1287,"usage_out":214,"latency_ms":1843.2,</w:t>
+      </w:r>
+    </w:p>
+    <w:p>
+      <w:pPr>
+        <w:shd w:fill="F2F2F2" w:val="clear"/>
+        <w:spacing w:after="160"/>
+        <w:ind w:left="240" w:right="240"/>
+      </w:pPr>
+      <w:r>
+        <w:rPr>
+          <w:rFonts w:ascii="Consolas" w:cs="Consolas" w:eastAsia="Consolas" w:hAnsi="Consolas"/>
+          <w:sz w:val="18"/>
+          <w:szCs w:val="18"/>
+        </w:rPr>
+        <w:t xml:space="preserve"> "scored":{"entity":false,"value":false,"omission":false}}</w:t>
+      </w:r>
+    </w:p>
+    <w:p>
+      <w:pPr>
+        <w:spacing w:after="120"/>
+      </w:pPr>
+      <w:r>
+        <w:rPr>
+          <w:i/>
+          <w:iCs/>
+        </w:rPr>
+        <w:t xml:space="preserve">Okuma: </w:t>
+      </w:r>
+      <w:r>
+        <w:rPr>
+          <w:i/>
+          <w:iCs/>
+        </w:rPr>
+        <w:t xml:space="preserve">bu yanıt ilk denemede bir varlık ihlaliyle reddedilmiş (rejections=1, kind=entity), düzeltme sonrası temiz alanlarla dönmüş; kullanıcıya bakan skorlar üç kanalda da temiz. usage_* alanları token sayımı, latency_ms uçtan uca gecikmedir (R6 telemetrisi).</w:t>
       </w:r>
     </w:p>
     <w:p>
@@ -6112,7 +6703,7 @@
         <w:spacing w:after="120"/>
       </w:pPr>
       <w:r>
-        <w:t xml:space="preserve">Kurulum: deepseek-chat, hücre başına N=200 canlı yanıt, kayıtlar paper/ablation_live_*.md dosyalarında. İki görev: sentetik çerçeve (monotone_log deseni) ve gerçek-veri Insurance görevi.</w:t>
+        <w:t xml:space="preserve">Kurulum: deepseek-chat uç noktası; hücre başına N = 200 bağımsız canlı yanıt (hücre tanımı ve k / N gösterimi için bkz. bölüm 1.5); ham kayıtlar paper/ablation_live_*.md dosyalarında. İki görev: sentetik çerçeve (monotone_log deseni) ve gerçek-veri Insurance görevi.</w:t>
       </w:r>
     </w:p>
     <w:tbl>
@@ -6128,10 +6719,10 @@
         </w:tblBorders>
       </w:tblPr>
       <w:tblGrid>
-        <w:gridCol w:w="3200"/>
-        <w:gridCol w:w="1800"/>
-        <w:gridCol w:w="1800"/>
-        <w:gridCol w:w="2226"/>
+        <w:gridCol w:w="3100"/>
+        <w:gridCol w:w="2100"/>
+        <w:gridCol w:w="1900"/>
+        <w:gridCol w:w="1926"/>
       </w:tblGrid>
       <w:tr>
         <w:trPr>
@@ -6139,7 +6730,7 @@
         </w:trPr>
         <w:tc>
           <w:tcPr>
-            <w:tcW w:type="dxa" w:w="3200"/>
+            <w:tcW w:type="dxa" w:w="3100"/>
             <w:tcBorders>
               <w:top w:val="single" w:color="BFBFBF" w:sz="1"/>
               <w:left w:val="single" w:color="BFBFBF" w:sz="1"/>
@@ -6171,7 +6762,7 @@
         </w:tc>
         <w:tc>
           <w:tcPr>
-            <w:tcW w:type="dxa" w:w="1800"/>
+            <w:tcW w:type="dxa" w:w="2100"/>
             <w:tcBorders>
               <w:top w:val="single" w:color="BFBFBF" w:sz="1"/>
               <w:left w:val="single" w:color="BFBFBF" w:sz="1"/>
@@ -6197,13 +6788,13 @@
                 <w:sz w:val="19"/>
                 <w:szCs w:val="19"/>
               </w:rPr>
-              <w:t xml:space="preserve">Varlık</w:t>
-            </w:r>
-          </w:p>
-        </w:tc>
-        <w:tc>
-          <w:tcPr>
-            <w:tcW w:type="dxa" w:w="1800"/>
+              <w:t xml:space="preserve">Varlık k/N (oran)</w:t>
+            </w:r>
+          </w:p>
+        </w:tc>
+        <w:tc>
+          <w:tcPr>
+            <w:tcW w:type="dxa" w:w="1900"/>
             <w:tcBorders>
               <w:top w:val="single" w:color="BFBFBF" w:sz="1"/>
               <w:left w:val="single" w:color="BFBFBF" w:sz="1"/>
@@ -6229,13 +6820,13 @@
                 <w:sz w:val="19"/>
                 <w:szCs w:val="19"/>
               </w:rPr>
-              <w:t xml:space="preserve">Değer</w:t>
-            </w:r>
-          </w:p>
-        </w:tc>
-        <w:tc>
-          <w:tcPr>
-            <w:tcW w:type="dxa" w:w="2226"/>
+              <w:t xml:space="preserve">Değer k/N</w:t>
+            </w:r>
+          </w:p>
+        </w:tc>
+        <w:tc>
+          <w:tcPr>
+            <w:tcW w:type="dxa" w:w="1926"/>
             <w:tcBorders>
               <w:top w:val="single" w:color="BFBFBF" w:sz="1"/>
               <w:left w:val="single" w:color="BFBFBF" w:sz="1"/>
@@ -6261,7 +6852,7 @@
                 <w:sz w:val="19"/>
                 <w:szCs w:val="19"/>
               </w:rPr>
-              <w:t xml:space="preserve">Omisyon</w:t>
+              <w:t xml:space="preserve">Omisyon k/N</w:t>
             </w:r>
           </w:p>
         </w:tc>
@@ -6272,7 +6863,7 @@
         </w:trPr>
         <w:tc>
           <w:tcPr>
-            <w:tcW w:type="dxa" w:w="3200"/>
+            <w:tcW w:type="dxa" w:w="3100"/>
             <w:tcBorders>
               <w:top w:val="single" w:color="BFBFBF" w:sz="1"/>
               <w:left w:val="single" w:color="BFBFBF" w:sz="1"/>
@@ -6303,94 +6894,94 @@
         </w:tc>
         <w:tc>
           <w:tcPr>
-            <w:tcW w:type="dxa" w:w="1800"/>
-            <w:tcBorders>
-              <w:top w:val="single" w:color="BFBFBF" w:sz="1"/>
-              <w:left w:val="single" w:color="BFBFBF" w:sz="1"/>
-              <w:bottom w:val="single" w:color="BFBFBF" w:sz="1"/>
-              <w:right w:val="single" w:color="BFBFBF" w:sz="1"/>
-            </w:tcBorders>
-            <w:tcMar>
-              <w:top w:type="dxa" w:w="60"/>
-              <w:left w:type="dxa" w:w="110"/>
-              <w:bottom w:type="dxa" w:w="60"/>
-              <w:right w:type="dxa" w:w="110"/>
-            </w:tcMar>
-          </w:tcPr>
-          <w:p>
-            <w:pPr>
-              <w:spacing w:after="0"/>
-            </w:pPr>
-            <w:r>
-              <w:rPr>
-                <w:b w:val="false"/>
-                <w:bCs w:val="false"/>
-                <w:sz w:val="19"/>
-                <w:szCs w:val="19"/>
-              </w:rPr>
-              <w:t xml:space="preserve">%15.0</w:t>
-            </w:r>
-          </w:p>
-        </w:tc>
-        <w:tc>
-          <w:tcPr>
-            <w:tcW w:type="dxa" w:w="1800"/>
-            <w:tcBorders>
-              <w:top w:val="single" w:color="BFBFBF" w:sz="1"/>
-              <w:left w:val="single" w:color="BFBFBF" w:sz="1"/>
-              <w:bottom w:val="single" w:color="BFBFBF" w:sz="1"/>
-              <w:right w:val="single" w:color="BFBFBF" w:sz="1"/>
-            </w:tcBorders>
-            <w:tcMar>
-              <w:top w:type="dxa" w:w="60"/>
-              <w:left w:type="dxa" w:w="110"/>
-              <w:bottom w:type="dxa" w:w="60"/>
-              <w:right w:type="dxa" w:w="110"/>
-            </w:tcMar>
-          </w:tcPr>
-          <w:p>
-            <w:pPr>
-              <w:spacing w:after="0"/>
-            </w:pPr>
-            <w:r>
-              <w:rPr>
-                <w:b w:val="false"/>
-                <w:bCs w:val="false"/>
-                <w:sz w:val="19"/>
-                <w:szCs w:val="19"/>
-              </w:rPr>
-              <w:t xml:space="preserve">0/200</w:t>
-            </w:r>
-          </w:p>
-        </w:tc>
-        <w:tc>
-          <w:tcPr>
-            <w:tcW w:type="dxa" w:w="2226"/>
-            <w:tcBorders>
-              <w:top w:val="single" w:color="BFBFBF" w:sz="1"/>
-              <w:left w:val="single" w:color="BFBFBF" w:sz="1"/>
-              <w:bottom w:val="single" w:color="BFBFBF" w:sz="1"/>
-              <w:right w:val="single" w:color="BFBFBF" w:sz="1"/>
-            </w:tcBorders>
-            <w:tcMar>
-              <w:top w:type="dxa" w:w="60"/>
-              <w:left w:type="dxa" w:w="110"/>
-              <w:bottom w:type="dxa" w:w="60"/>
-              <w:right w:type="dxa" w:w="110"/>
-            </w:tcMar>
-          </w:tcPr>
-          <w:p>
-            <w:pPr>
-              <w:spacing w:after="0"/>
-            </w:pPr>
-            <w:r>
-              <w:rPr>
-                <w:b w:val="false"/>
-                <w:bCs w:val="false"/>
-                <w:sz w:val="19"/>
-                <w:szCs w:val="19"/>
-              </w:rPr>
-              <w:t xml:space="preserve">0/200</w:t>
+            <w:tcW w:type="dxa" w:w="2100"/>
+            <w:tcBorders>
+              <w:top w:val="single" w:color="BFBFBF" w:sz="1"/>
+              <w:left w:val="single" w:color="BFBFBF" w:sz="1"/>
+              <w:bottom w:val="single" w:color="BFBFBF" w:sz="1"/>
+              <w:right w:val="single" w:color="BFBFBF" w:sz="1"/>
+            </w:tcBorders>
+            <w:tcMar>
+              <w:top w:type="dxa" w:w="60"/>
+              <w:left w:type="dxa" w:w="110"/>
+              <w:bottom w:type="dxa" w:w="60"/>
+              <w:right w:type="dxa" w:w="110"/>
+            </w:tcMar>
+          </w:tcPr>
+          <w:p>
+            <w:pPr>
+              <w:spacing w:after="0"/>
+            </w:pPr>
+            <w:r>
+              <w:rPr>
+                <w:b w:val="false"/>
+                <w:bCs w:val="false"/>
+                <w:sz w:val="19"/>
+                <w:szCs w:val="19"/>
+              </w:rPr>
+              <w:t xml:space="preserve">30 / 200 (%15.0)</w:t>
+            </w:r>
+          </w:p>
+        </w:tc>
+        <w:tc>
+          <w:tcPr>
+            <w:tcW w:type="dxa" w:w="1900"/>
+            <w:tcBorders>
+              <w:top w:val="single" w:color="BFBFBF" w:sz="1"/>
+              <w:left w:val="single" w:color="BFBFBF" w:sz="1"/>
+              <w:bottom w:val="single" w:color="BFBFBF" w:sz="1"/>
+              <w:right w:val="single" w:color="BFBFBF" w:sz="1"/>
+            </w:tcBorders>
+            <w:tcMar>
+              <w:top w:type="dxa" w:w="60"/>
+              <w:left w:type="dxa" w:w="110"/>
+              <w:bottom w:type="dxa" w:w="60"/>
+              <w:right w:type="dxa" w:w="110"/>
+            </w:tcMar>
+          </w:tcPr>
+          <w:p>
+            <w:pPr>
+              <w:spacing w:after="0"/>
+            </w:pPr>
+            <w:r>
+              <w:rPr>
+                <w:b w:val="false"/>
+                <w:bCs w:val="false"/>
+                <w:sz w:val="19"/>
+                <w:szCs w:val="19"/>
+              </w:rPr>
+              <w:t xml:space="preserve">0 / 200</w:t>
+            </w:r>
+          </w:p>
+        </w:tc>
+        <w:tc>
+          <w:tcPr>
+            <w:tcW w:type="dxa" w:w="1926"/>
+            <w:tcBorders>
+              <w:top w:val="single" w:color="BFBFBF" w:sz="1"/>
+              <w:left w:val="single" w:color="BFBFBF" w:sz="1"/>
+              <w:bottom w:val="single" w:color="BFBFBF" w:sz="1"/>
+              <w:right w:val="single" w:color="BFBFBF" w:sz="1"/>
+            </w:tcBorders>
+            <w:tcMar>
+              <w:top w:type="dxa" w:w="60"/>
+              <w:left w:type="dxa" w:w="110"/>
+              <w:bottom w:type="dxa" w:w="60"/>
+              <w:right w:type="dxa" w:w="110"/>
+            </w:tcMar>
+          </w:tcPr>
+          <w:p>
+            <w:pPr>
+              <w:spacing w:after="0"/>
+            </w:pPr>
+            <w:r>
+              <w:rPr>
+                <w:b w:val="false"/>
+                <w:bCs w:val="false"/>
+                <w:sz w:val="19"/>
+                <w:szCs w:val="19"/>
+              </w:rPr>
+              <w:t xml:space="preserve">0 / 200</w:t>
             </w:r>
           </w:p>
         </w:tc>
@@ -6401,7 +6992,7 @@
         </w:trPr>
         <w:tc>
           <w:tcPr>
-            <w:tcW w:type="dxa" w:w="3200"/>
+            <w:tcW w:type="dxa" w:w="3100"/>
             <w:tcBorders>
               <w:top w:val="single" w:color="BFBFBF" w:sz="1"/>
               <w:left w:val="single" w:color="BFBFBF" w:sz="1"/>
@@ -6432,94 +7023,94 @@
         </w:tc>
         <w:tc>
           <w:tcPr>
-            <w:tcW w:type="dxa" w:w="1800"/>
-            <w:tcBorders>
-              <w:top w:val="single" w:color="BFBFBF" w:sz="1"/>
-              <w:left w:val="single" w:color="BFBFBF" w:sz="1"/>
-              <w:bottom w:val="single" w:color="BFBFBF" w:sz="1"/>
-              <w:right w:val="single" w:color="BFBFBF" w:sz="1"/>
-            </w:tcBorders>
-            <w:tcMar>
-              <w:top w:type="dxa" w:w="60"/>
-              <w:left w:type="dxa" w:w="110"/>
-              <w:bottom w:type="dxa" w:w="60"/>
-              <w:right w:type="dxa" w:w="110"/>
-            </w:tcMar>
-          </w:tcPr>
-          <w:p>
-            <w:pPr>
-              <w:spacing w:after="0"/>
-            </w:pPr>
-            <w:r>
-              <w:rPr>
-                <w:b w:val="false"/>
-                <w:bCs w:val="false"/>
-                <w:sz w:val="19"/>
-                <w:szCs w:val="19"/>
-              </w:rPr>
-              <w:t xml:space="preserve">%11.5</w:t>
-            </w:r>
-          </w:p>
-        </w:tc>
-        <w:tc>
-          <w:tcPr>
-            <w:tcW w:type="dxa" w:w="1800"/>
-            <w:tcBorders>
-              <w:top w:val="single" w:color="BFBFBF" w:sz="1"/>
-              <w:left w:val="single" w:color="BFBFBF" w:sz="1"/>
-              <w:bottom w:val="single" w:color="BFBFBF" w:sz="1"/>
-              <w:right w:val="single" w:color="BFBFBF" w:sz="1"/>
-            </w:tcBorders>
-            <w:tcMar>
-              <w:top w:type="dxa" w:w="60"/>
-              <w:left w:type="dxa" w:w="110"/>
-              <w:bottom w:type="dxa" w:w="60"/>
-              <w:right w:type="dxa" w:w="110"/>
-            </w:tcMar>
-          </w:tcPr>
-          <w:p>
-            <w:pPr>
-              <w:spacing w:after="0"/>
-            </w:pPr>
-            <w:r>
-              <w:rPr>
-                <w:b w:val="false"/>
-                <w:bCs w:val="false"/>
-                <w:sz w:val="19"/>
-                <w:szCs w:val="19"/>
-              </w:rPr>
-              <w:t xml:space="preserve">0/200</w:t>
-            </w:r>
-          </w:p>
-        </w:tc>
-        <w:tc>
-          <w:tcPr>
-            <w:tcW w:type="dxa" w:w="2226"/>
-            <w:tcBorders>
-              <w:top w:val="single" w:color="BFBFBF" w:sz="1"/>
-              <w:left w:val="single" w:color="BFBFBF" w:sz="1"/>
-              <w:bottom w:val="single" w:color="BFBFBF" w:sz="1"/>
-              <w:right w:val="single" w:color="BFBFBF" w:sz="1"/>
-            </w:tcBorders>
-            <w:tcMar>
-              <w:top w:type="dxa" w:w="60"/>
-              <w:left w:type="dxa" w:w="110"/>
-              <w:bottom w:type="dxa" w:w="60"/>
-              <w:right w:type="dxa" w:w="110"/>
-            </w:tcMar>
-          </w:tcPr>
-          <w:p>
-            <w:pPr>
-              <w:spacing w:after="0"/>
-            </w:pPr>
-            <w:r>
-              <w:rPr>
-                <w:b w:val="false"/>
-                <w:bCs w:val="false"/>
-                <w:sz w:val="19"/>
-                <w:szCs w:val="19"/>
-              </w:rPr>
-              <w:t xml:space="preserve">0/200</w:t>
+            <w:tcW w:type="dxa" w:w="2100"/>
+            <w:tcBorders>
+              <w:top w:val="single" w:color="BFBFBF" w:sz="1"/>
+              <w:left w:val="single" w:color="BFBFBF" w:sz="1"/>
+              <w:bottom w:val="single" w:color="BFBFBF" w:sz="1"/>
+              <w:right w:val="single" w:color="BFBFBF" w:sz="1"/>
+            </w:tcBorders>
+            <w:tcMar>
+              <w:top w:type="dxa" w:w="60"/>
+              <w:left w:type="dxa" w:w="110"/>
+              <w:bottom w:type="dxa" w:w="60"/>
+              <w:right w:type="dxa" w:w="110"/>
+            </w:tcMar>
+          </w:tcPr>
+          <w:p>
+            <w:pPr>
+              <w:spacing w:after="0"/>
+            </w:pPr>
+            <w:r>
+              <w:rPr>
+                <w:b w:val="false"/>
+                <w:bCs w:val="false"/>
+                <w:sz w:val="19"/>
+                <w:szCs w:val="19"/>
+              </w:rPr>
+              <w:t xml:space="preserve">23 / 200 (%11.5)</w:t>
+            </w:r>
+          </w:p>
+        </w:tc>
+        <w:tc>
+          <w:tcPr>
+            <w:tcW w:type="dxa" w:w="1900"/>
+            <w:tcBorders>
+              <w:top w:val="single" w:color="BFBFBF" w:sz="1"/>
+              <w:left w:val="single" w:color="BFBFBF" w:sz="1"/>
+              <w:bottom w:val="single" w:color="BFBFBF" w:sz="1"/>
+              <w:right w:val="single" w:color="BFBFBF" w:sz="1"/>
+            </w:tcBorders>
+            <w:tcMar>
+              <w:top w:type="dxa" w:w="60"/>
+              <w:left w:type="dxa" w:w="110"/>
+              <w:bottom w:type="dxa" w:w="60"/>
+              <w:right w:type="dxa" w:w="110"/>
+            </w:tcMar>
+          </w:tcPr>
+          <w:p>
+            <w:pPr>
+              <w:spacing w:after="0"/>
+            </w:pPr>
+            <w:r>
+              <w:rPr>
+                <w:b w:val="false"/>
+                <w:bCs w:val="false"/>
+                <w:sz w:val="19"/>
+                <w:szCs w:val="19"/>
+              </w:rPr>
+              <w:t xml:space="preserve">0 / 200</w:t>
+            </w:r>
+          </w:p>
+        </w:tc>
+        <w:tc>
+          <w:tcPr>
+            <w:tcW w:type="dxa" w:w="1926"/>
+            <w:tcBorders>
+              <w:top w:val="single" w:color="BFBFBF" w:sz="1"/>
+              <w:left w:val="single" w:color="BFBFBF" w:sz="1"/>
+              <w:bottom w:val="single" w:color="BFBFBF" w:sz="1"/>
+              <w:right w:val="single" w:color="BFBFBF" w:sz="1"/>
+            </w:tcBorders>
+            <w:tcMar>
+              <w:top w:type="dxa" w:w="60"/>
+              <w:left w:type="dxa" w:w="110"/>
+              <w:bottom w:type="dxa" w:w="60"/>
+              <w:right w:type="dxa" w:w="110"/>
+            </w:tcMar>
+          </w:tcPr>
+          <w:p>
+            <w:pPr>
+              <w:spacing w:after="0"/>
+            </w:pPr>
+            <w:r>
+              <w:rPr>
+                <w:b w:val="false"/>
+                <w:bCs w:val="false"/>
+                <w:sz w:val="19"/>
+                <w:szCs w:val="19"/>
+              </w:rPr>
+              <w:t xml:space="preserve">0 / 200</w:t>
             </w:r>
           </w:p>
         </w:tc>
@@ -6530,7 +7121,7 @@
         </w:trPr>
         <w:tc>
           <w:tcPr>
-            <w:tcW w:type="dxa" w:w="3200"/>
+            <w:tcW w:type="dxa" w:w="3100"/>
             <w:tcBorders>
               <w:top w:val="single" w:color="BFBFBF" w:sz="1"/>
               <w:left w:val="single" w:color="BFBFBF" w:sz="1"/>
@@ -6561,94 +7152,94 @@
         </w:tc>
         <w:tc>
           <w:tcPr>
-            <w:tcW w:type="dxa" w:w="1800"/>
-            <w:tcBorders>
-              <w:top w:val="single" w:color="BFBFBF" w:sz="1"/>
-              <w:left w:val="single" w:color="BFBFBF" w:sz="1"/>
-              <w:bottom w:val="single" w:color="BFBFBF" w:sz="1"/>
-              <w:right w:val="single" w:color="BFBFBF" w:sz="1"/>
-            </w:tcBorders>
-            <w:tcMar>
-              <w:top w:type="dxa" w:w="60"/>
-              <w:left w:type="dxa" w:w="110"/>
-              <w:bottom w:type="dxa" w:w="60"/>
-              <w:right w:type="dxa" w:w="110"/>
-            </w:tcMar>
-          </w:tcPr>
-          <w:p>
-            <w:pPr>
-              <w:spacing w:after="0"/>
-            </w:pPr>
-            <w:r>
-              <w:rPr>
-                <w:b w:val="false"/>
-                <w:bCs w:val="false"/>
-                <w:sz w:val="19"/>
-                <w:szCs w:val="19"/>
-              </w:rPr>
-              <w:t xml:space="preserve">0/200</w:t>
-            </w:r>
-          </w:p>
-        </w:tc>
-        <w:tc>
-          <w:tcPr>
-            <w:tcW w:type="dxa" w:w="1800"/>
-            <w:tcBorders>
-              <w:top w:val="single" w:color="BFBFBF" w:sz="1"/>
-              <w:left w:val="single" w:color="BFBFBF" w:sz="1"/>
-              <w:bottom w:val="single" w:color="BFBFBF" w:sz="1"/>
-              <w:right w:val="single" w:color="BFBFBF" w:sz="1"/>
-            </w:tcBorders>
-            <w:tcMar>
-              <w:top w:type="dxa" w:w="60"/>
-              <w:left w:type="dxa" w:w="110"/>
-              <w:bottom w:type="dxa" w:w="60"/>
-              <w:right w:type="dxa" w:w="110"/>
-            </w:tcMar>
-          </w:tcPr>
-          <w:p>
-            <w:pPr>
-              <w:spacing w:after="0"/>
-            </w:pPr>
-            <w:r>
-              <w:rPr>
-                <w:b w:val="false"/>
-                <w:bCs w:val="false"/>
-                <w:sz w:val="19"/>
-                <w:szCs w:val="19"/>
-              </w:rPr>
-              <w:t xml:space="preserve">0/200</w:t>
-            </w:r>
-          </w:p>
-        </w:tc>
-        <w:tc>
-          <w:tcPr>
-            <w:tcW w:type="dxa" w:w="2226"/>
-            <w:tcBorders>
-              <w:top w:val="single" w:color="BFBFBF" w:sz="1"/>
-              <w:left w:val="single" w:color="BFBFBF" w:sz="1"/>
-              <w:bottom w:val="single" w:color="BFBFBF" w:sz="1"/>
-              <w:right w:val="single" w:color="BFBFBF" w:sz="1"/>
-            </w:tcBorders>
-            <w:tcMar>
-              <w:top w:type="dxa" w:w="60"/>
-              <w:left w:type="dxa" w:w="110"/>
-              <w:bottom w:type="dxa" w:w="60"/>
-              <w:right w:type="dxa" w:w="110"/>
-            </w:tcMar>
-          </w:tcPr>
-          <w:p>
-            <w:pPr>
-              <w:spacing w:after="0"/>
-            </w:pPr>
-            <w:r>
-              <w:rPr>
-                <w:b w:val="false"/>
-                <w:bCs w:val="false"/>
-                <w:sz w:val="19"/>
-                <w:szCs w:val="19"/>
-              </w:rPr>
-              <w:t xml:space="preserve">0/200</w:t>
+            <w:tcW w:type="dxa" w:w="2100"/>
+            <w:tcBorders>
+              <w:top w:val="single" w:color="BFBFBF" w:sz="1"/>
+              <w:left w:val="single" w:color="BFBFBF" w:sz="1"/>
+              <w:bottom w:val="single" w:color="BFBFBF" w:sz="1"/>
+              <w:right w:val="single" w:color="BFBFBF" w:sz="1"/>
+            </w:tcBorders>
+            <w:tcMar>
+              <w:top w:type="dxa" w:w="60"/>
+              <w:left w:type="dxa" w:w="110"/>
+              <w:bottom w:type="dxa" w:w="60"/>
+              <w:right w:type="dxa" w:w="110"/>
+            </w:tcMar>
+          </w:tcPr>
+          <w:p>
+            <w:pPr>
+              <w:spacing w:after="0"/>
+            </w:pPr>
+            <w:r>
+              <w:rPr>
+                <w:b w:val="false"/>
+                <w:bCs w:val="false"/>
+                <w:sz w:val="19"/>
+                <w:szCs w:val="19"/>
+              </w:rPr>
+              <w:t xml:space="preserve">0 / 200 (%0.0)</w:t>
+            </w:r>
+          </w:p>
+        </w:tc>
+        <w:tc>
+          <w:tcPr>
+            <w:tcW w:type="dxa" w:w="1900"/>
+            <w:tcBorders>
+              <w:top w:val="single" w:color="BFBFBF" w:sz="1"/>
+              <w:left w:val="single" w:color="BFBFBF" w:sz="1"/>
+              <w:bottom w:val="single" w:color="BFBFBF" w:sz="1"/>
+              <w:right w:val="single" w:color="BFBFBF" w:sz="1"/>
+            </w:tcBorders>
+            <w:tcMar>
+              <w:top w:type="dxa" w:w="60"/>
+              <w:left w:type="dxa" w:w="110"/>
+              <w:bottom w:type="dxa" w:w="60"/>
+              <w:right w:type="dxa" w:w="110"/>
+            </w:tcMar>
+          </w:tcPr>
+          <w:p>
+            <w:pPr>
+              <w:spacing w:after="0"/>
+            </w:pPr>
+            <w:r>
+              <w:rPr>
+                <w:b w:val="false"/>
+                <w:bCs w:val="false"/>
+                <w:sz w:val="19"/>
+                <w:szCs w:val="19"/>
+              </w:rPr>
+              <w:t xml:space="preserve">0 / 200</w:t>
+            </w:r>
+          </w:p>
+        </w:tc>
+        <w:tc>
+          <w:tcPr>
+            <w:tcW w:type="dxa" w:w="1926"/>
+            <w:tcBorders>
+              <w:top w:val="single" w:color="BFBFBF" w:sz="1"/>
+              <w:left w:val="single" w:color="BFBFBF" w:sz="1"/>
+              <w:bottom w:val="single" w:color="BFBFBF" w:sz="1"/>
+              <w:right w:val="single" w:color="BFBFBF" w:sz="1"/>
+            </w:tcBorders>
+            <w:tcMar>
+              <w:top w:type="dxa" w:w="60"/>
+              <w:left w:type="dxa" w:w="110"/>
+              <w:bottom w:type="dxa" w:w="60"/>
+              <w:right w:type="dxa" w:w="110"/>
+            </w:tcMar>
+          </w:tcPr>
+          <w:p>
+            <w:pPr>
+              <w:spacing w:after="0"/>
+            </w:pPr>
+            <w:r>
+              <w:rPr>
+                <w:b w:val="false"/>
+                <w:bCs w:val="false"/>
+                <w:sz w:val="19"/>
+                <w:szCs w:val="19"/>
+              </w:rPr>
+              <w:t xml:space="preserve">0 / 200</w:t>
             </w:r>
           </w:p>
         </w:tc>
@@ -6659,7 +7250,7 @@
         </w:trPr>
         <w:tc>
           <w:tcPr>
-            <w:tcW w:type="dxa" w:w="3200"/>
+            <w:tcW w:type="dxa" w:w="3100"/>
             <w:tcBorders>
               <w:top w:val="single" w:color="BFBFBF" w:sz="1"/>
               <w:left w:val="single" w:color="BFBFBF" w:sz="1"/>
@@ -6690,94 +7281,94 @@
         </w:tc>
         <w:tc>
           <w:tcPr>
-            <w:tcW w:type="dxa" w:w="1800"/>
-            <w:tcBorders>
-              <w:top w:val="single" w:color="BFBFBF" w:sz="1"/>
-              <w:left w:val="single" w:color="BFBFBF" w:sz="1"/>
-              <w:bottom w:val="single" w:color="BFBFBF" w:sz="1"/>
-              <w:right w:val="single" w:color="BFBFBF" w:sz="1"/>
-            </w:tcBorders>
-            <w:tcMar>
-              <w:top w:type="dxa" w:w="60"/>
-              <w:left w:type="dxa" w:w="110"/>
-              <w:bottom w:type="dxa" w:w="60"/>
-              <w:right w:type="dxa" w:w="110"/>
-            </w:tcMar>
-          </w:tcPr>
-          <w:p>
-            <w:pPr>
-              <w:spacing w:after="0"/>
-            </w:pPr>
-            <w:r>
-              <w:rPr>
-                <w:b w:val="false"/>
-                <w:bCs w:val="false"/>
-                <w:sz w:val="19"/>
-                <w:szCs w:val="19"/>
-              </w:rPr>
-              <w:t xml:space="preserve">%43.5</w:t>
-            </w:r>
-          </w:p>
-        </w:tc>
-        <w:tc>
-          <w:tcPr>
-            <w:tcW w:type="dxa" w:w="1800"/>
-            <w:tcBorders>
-              <w:top w:val="single" w:color="BFBFBF" w:sz="1"/>
-              <w:left w:val="single" w:color="BFBFBF" w:sz="1"/>
-              <w:bottom w:val="single" w:color="BFBFBF" w:sz="1"/>
-              <w:right w:val="single" w:color="BFBFBF" w:sz="1"/>
-            </w:tcBorders>
-            <w:tcMar>
-              <w:top w:type="dxa" w:w="60"/>
-              <w:left w:type="dxa" w:w="110"/>
-              <w:bottom w:type="dxa" w:w="60"/>
-              <w:right w:type="dxa" w:w="110"/>
-            </w:tcMar>
-          </w:tcPr>
-          <w:p>
-            <w:pPr>
-              <w:spacing w:after="0"/>
-            </w:pPr>
-            <w:r>
-              <w:rPr>
-                <w:b w:val="false"/>
-                <w:bCs w:val="false"/>
-                <w:sz w:val="19"/>
-                <w:szCs w:val="19"/>
-              </w:rPr>
-              <w:t xml:space="preserve">0/200</w:t>
-            </w:r>
-          </w:p>
-        </w:tc>
-        <w:tc>
-          <w:tcPr>
-            <w:tcW w:type="dxa" w:w="2226"/>
-            <w:tcBorders>
-              <w:top w:val="single" w:color="BFBFBF" w:sz="1"/>
-              <w:left w:val="single" w:color="BFBFBF" w:sz="1"/>
-              <w:bottom w:val="single" w:color="BFBFBF" w:sz="1"/>
-              <w:right w:val="single" w:color="BFBFBF" w:sz="1"/>
-            </w:tcBorders>
-            <w:tcMar>
-              <w:top w:type="dxa" w:w="60"/>
-              <w:left w:type="dxa" w:w="110"/>
-              <w:bottom w:type="dxa" w:w="60"/>
-              <w:right w:type="dxa" w:w="110"/>
-            </w:tcMar>
-          </w:tcPr>
-          <w:p>
-            <w:pPr>
-              <w:spacing w:after="0"/>
-            </w:pPr>
-            <w:r>
-              <w:rPr>
-                <w:b w:val="false"/>
-                <w:bCs w:val="false"/>
-                <w:sz w:val="19"/>
-                <w:szCs w:val="19"/>
-              </w:rPr>
-              <w:t xml:space="preserve">0/200</w:t>
+            <w:tcW w:type="dxa" w:w="2100"/>
+            <w:tcBorders>
+              <w:top w:val="single" w:color="BFBFBF" w:sz="1"/>
+              <w:left w:val="single" w:color="BFBFBF" w:sz="1"/>
+              <w:bottom w:val="single" w:color="BFBFBF" w:sz="1"/>
+              <w:right w:val="single" w:color="BFBFBF" w:sz="1"/>
+            </w:tcBorders>
+            <w:tcMar>
+              <w:top w:type="dxa" w:w="60"/>
+              <w:left w:type="dxa" w:w="110"/>
+              <w:bottom w:type="dxa" w:w="60"/>
+              <w:right w:type="dxa" w:w="110"/>
+            </w:tcMar>
+          </w:tcPr>
+          <w:p>
+            <w:pPr>
+              <w:spacing w:after="0"/>
+            </w:pPr>
+            <w:r>
+              <w:rPr>
+                <w:b w:val="false"/>
+                <w:bCs w:val="false"/>
+                <w:sz w:val="19"/>
+                <w:szCs w:val="19"/>
+              </w:rPr>
+              <w:t xml:space="preserve">87 / 200 (%43.5)</w:t>
+            </w:r>
+          </w:p>
+        </w:tc>
+        <w:tc>
+          <w:tcPr>
+            <w:tcW w:type="dxa" w:w="1900"/>
+            <w:tcBorders>
+              <w:top w:val="single" w:color="BFBFBF" w:sz="1"/>
+              <w:left w:val="single" w:color="BFBFBF" w:sz="1"/>
+              <w:bottom w:val="single" w:color="BFBFBF" w:sz="1"/>
+              <w:right w:val="single" w:color="BFBFBF" w:sz="1"/>
+            </w:tcBorders>
+            <w:tcMar>
+              <w:top w:type="dxa" w:w="60"/>
+              <w:left w:type="dxa" w:w="110"/>
+              <w:bottom w:type="dxa" w:w="60"/>
+              <w:right w:type="dxa" w:w="110"/>
+            </w:tcMar>
+          </w:tcPr>
+          <w:p>
+            <w:pPr>
+              <w:spacing w:after="0"/>
+            </w:pPr>
+            <w:r>
+              <w:rPr>
+                <w:b w:val="false"/>
+                <w:bCs w:val="false"/>
+                <w:sz w:val="19"/>
+                <w:szCs w:val="19"/>
+              </w:rPr>
+              <w:t xml:space="preserve">0 / 200</w:t>
+            </w:r>
+          </w:p>
+        </w:tc>
+        <w:tc>
+          <w:tcPr>
+            <w:tcW w:type="dxa" w:w="1926"/>
+            <w:tcBorders>
+              <w:top w:val="single" w:color="BFBFBF" w:sz="1"/>
+              <w:left w:val="single" w:color="BFBFBF" w:sz="1"/>
+              <w:bottom w:val="single" w:color="BFBFBF" w:sz="1"/>
+              <w:right w:val="single" w:color="BFBFBF" w:sz="1"/>
+            </w:tcBorders>
+            <w:tcMar>
+              <w:top w:type="dxa" w:w="60"/>
+              <w:left w:type="dxa" w:w="110"/>
+              <w:bottom w:type="dxa" w:w="60"/>
+              <w:right w:type="dxa" w:w="110"/>
+            </w:tcMar>
+          </w:tcPr>
+          <w:p>
+            <w:pPr>
+              <w:spacing w:after="0"/>
+            </w:pPr>
+            <w:r>
+              <w:rPr>
+                <w:b w:val="false"/>
+                <w:bCs w:val="false"/>
+                <w:sz w:val="19"/>
+                <w:szCs w:val="19"/>
+              </w:rPr>
+              <w:t xml:space="preserve">0 / 200</w:t>
             </w:r>
           </w:p>
         </w:tc>
@@ -6788,7 +7379,7 @@
         </w:trPr>
         <w:tc>
           <w:tcPr>
-            <w:tcW w:type="dxa" w:w="3200"/>
+            <w:tcW w:type="dxa" w:w="3100"/>
             <w:tcBorders>
               <w:top w:val="single" w:color="BFBFBF" w:sz="1"/>
               <w:left w:val="single" w:color="BFBFBF" w:sz="1"/>
@@ -6819,94 +7410,94 @@
         </w:tc>
         <w:tc>
           <w:tcPr>
-            <w:tcW w:type="dxa" w:w="1800"/>
-            <w:tcBorders>
-              <w:top w:val="single" w:color="BFBFBF" w:sz="1"/>
-              <w:left w:val="single" w:color="BFBFBF" w:sz="1"/>
-              <w:bottom w:val="single" w:color="BFBFBF" w:sz="1"/>
-              <w:right w:val="single" w:color="BFBFBF" w:sz="1"/>
-            </w:tcBorders>
-            <w:tcMar>
-              <w:top w:type="dxa" w:w="60"/>
-              <w:left w:type="dxa" w:w="110"/>
-              <w:bottom w:type="dxa" w:w="60"/>
-              <w:right w:type="dxa" w:w="110"/>
-            </w:tcMar>
-          </w:tcPr>
-          <w:p>
-            <w:pPr>
-              <w:spacing w:after="0"/>
-            </w:pPr>
-            <w:r>
-              <w:rPr>
-                <w:b w:val="false"/>
-                <w:bCs w:val="false"/>
-                <w:sz w:val="19"/>
-                <w:szCs w:val="19"/>
-              </w:rPr>
-              <w:t xml:space="preserve">0/200</w:t>
-            </w:r>
-          </w:p>
-        </w:tc>
-        <w:tc>
-          <w:tcPr>
-            <w:tcW w:type="dxa" w:w="1800"/>
-            <w:tcBorders>
-              <w:top w:val="single" w:color="BFBFBF" w:sz="1"/>
-              <w:left w:val="single" w:color="BFBFBF" w:sz="1"/>
-              <w:bottom w:val="single" w:color="BFBFBF" w:sz="1"/>
-              <w:right w:val="single" w:color="BFBFBF" w:sz="1"/>
-            </w:tcBorders>
-            <w:tcMar>
-              <w:top w:type="dxa" w:w="60"/>
-              <w:left w:type="dxa" w:w="110"/>
-              <w:bottom w:type="dxa" w:w="60"/>
-              <w:right w:type="dxa" w:w="110"/>
-            </w:tcMar>
-          </w:tcPr>
-          <w:p>
-            <w:pPr>
-              <w:spacing w:after="0"/>
-            </w:pPr>
-            <w:r>
-              <w:rPr>
-                <w:b w:val="false"/>
-                <w:bCs w:val="false"/>
-                <w:sz w:val="19"/>
-                <w:szCs w:val="19"/>
-              </w:rPr>
-              <w:t xml:space="preserve">0/200</w:t>
-            </w:r>
-          </w:p>
-        </w:tc>
-        <w:tc>
-          <w:tcPr>
-            <w:tcW w:type="dxa" w:w="2226"/>
-            <w:tcBorders>
-              <w:top w:val="single" w:color="BFBFBF" w:sz="1"/>
-              <w:left w:val="single" w:color="BFBFBF" w:sz="1"/>
-              <w:bottom w:val="single" w:color="BFBFBF" w:sz="1"/>
-              <w:right w:val="single" w:color="BFBFBF" w:sz="1"/>
-            </w:tcBorders>
-            <w:tcMar>
-              <w:top w:type="dxa" w:w="60"/>
-              <w:left w:type="dxa" w:w="110"/>
-              <w:bottom w:type="dxa" w:w="60"/>
-              <w:right w:type="dxa" w:w="110"/>
-            </w:tcMar>
-          </w:tcPr>
-          <w:p>
-            <w:pPr>
-              <w:spacing w:after="0"/>
-            </w:pPr>
-            <w:r>
-              <w:rPr>
-                <w:b w:val="false"/>
-                <w:bCs w:val="false"/>
-                <w:sz w:val="19"/>
-                <w:szCs w:val="19"/>
-              </w:rPr>
-              <w:t xml:space="preserve">0/200</w:t>
+            <w:tcW w:type="dxa" w:w="2100"/>
+            <w:tcBorders>
+              <w:top w:val="single" w:color="BFBFBF" w:sz="1"/>
+              <w:left w:val="single" w:color="BFBFBF" w:sz="1"/>
+              <w:bottom w:val="single" w:color="BFBFBF" w:sz="1"/>
+              <w:right w:val="single" w:color="BFBFBF" w:sz="1"/>
+            </w:tcBorders>
+            <w:tcMar>
+              <w:top w:type="dxa" w:w="60"/>
+              <w:left w:type="dxa" w:w="110"/>
+              <w:bottom w:type="dxa" w:w="60"/>
+              <w:right w:type="dxa" w:w="110"/>
+            </w:tcMar>
+          </w:tcPr>
+          <w:p>
+            <w:pPr>
+              <w:spacing w:after="0"/>
+            </w:pPr>
+            <w:r>
+              <w:rPr>
+                <w:b w:val="false"/>
+                <w:bCs w:val="false"/>
+                <w:sz w:val="19"/>
+                <w:szCs w:val="19"/>
+              </w:rPr>
+              <w:t xml:space="preserve">0 / 200 (%0.0)</w:t>
+            </w:r>
+          </w:p>
+        </w:tc>
+        <w:tc>
+          <w:tcPr>
+            <w:tcW w:type="dxa" w:w="1900"/>
+            <w:tcBorders>
+              <w:top w:val="single" w:color="BFBFBF" w:sz="1"/>
+              <w:left w:val="single" w:color="BFBFBF" w:sz="1"/>
+              <w:bottom w:val="single" w:color="BFBFBF" w:sz="1"/>
+              <w:right w:val="single" w:color="BFBFBF" w:sz="1"/>
+            </w:tcBorders>
+            <w:tcMar>
+              <w:top w:type="dxa" w:w="60"/>
+              <w:left w:type="dxa" w:w="110"/>
+              <w:bottom w:type="dxa" w:w="60"/>
+              <w:right w:type="dxa" w:w="110"/>
+            </w:tcMar>
+          </w:tcPr>
+          <w:p>
+            <w:pPr>
+              <w:spacing w:after="0"/>
+            </w:pPr>
+            <w:r>
+              <w:rPr>
+                <w:b w:val="false"/>
+                <w:bCs w:val="false"/>
+                <w:sz w:val="19"/>
+                <w:szCs w:val="19"/>
+              </w:rPr>
+              <w:t xml:space="preserve">0 / 200</w:t>
+            </w:r>
+          </w:p>
+        </w:tc>
+        <w:tc>
+          <w:tcPr>
+            <w:tcW w:type="dxa" w:w="1926"/>
+            <w:tcBorders>
+              <w:top w:val="single" w:color="BFBFBF" w:sz="1"/>
+              <w:left w:val="single" w:color="BFBFBF" w:sz="1"/>
+              <w:bottom w:val="single" w:color="BFBFBF" w:sz="1"/>
+              <w:right w:val="single" w:color="BFBFBF" w:sz="1"/>
+            </w:tcBorders>
+            <w:tcMar>
+              <w:top w:type="dxa" w:w="60"/>
+              <w:left w:type="dxa" w:w="110"/>
+              <w:bottom w:type="dxa" w:w="60"/>
+              <w:right w:type="dxa" w:w="110"/>
+            </w:tcMar>
+          </w:tcPr>
+          <w:p>
+            <w:pPr>
+              <w:spacing w:after="0"/>
+            </w:pPr>
+            <w:r>
+              <w:rPr>
+                <w:b w:val="false"/>
+                <w:bCs w:val="false"/>
+                <w:sz w:val="19"/>
+                <w:szCs w:val="19"/>
+              </w:rPr>
+              <w:t xml:space="preserve">0 / 200</w:t>
             </w:r>
           </w:p>
         </w:tc>
@@ -6917,7 +7508,14 @@
         <w:spacing w:after="120"/>
       </w:pPr>
       <w:r>
-        <w:t xml:space="preserve"/>
+        <w:rPr>
+          <w:b/>
+          <w:bCs/>
+        </w:rPr>
+        <w:t xml:space="preserve">Tablo okuma: </w:t>
+      </w:r>
+      <w:r>
+        <w:t xml:space="preserve">k / N = hücredeki 200 bağımsız yanıtın k tanesinde ilgili kanalda en az bir ihlal var. Örnek: 30 / 200, “200 yanıtın 30’unda kanıt dışı sütun atfı gözlendi” demektir (%15.0). 0 / 200 satırları sıfır GÖZLEM bildirir, kesin sıfır değil: Wilson %95 üst sınırı %1.88’dir (bkz. 1.5). L1 hücrelerinde değer ve omisyon kanallarının 0 / 200 çıkması, o görev şeklinin bu kanalları yeterince stres etmemesindendir; kanal-aktivasyon tahminleri ve #14 stresörü tam bu boşluk için ön-kayda alındı (A3.3, A3.4).</w:t>
       </w:r>
     </w:p>
     <w:p>
@@ -6977,7 +7575,7 @@
         <w:t xml:space="preserve">tier_a izole: </w:t>
       </w:r>
       <w:r>
-        <w:t xml:space="preserve">yalnız enum (doğrulama yok) %11.5’i 0/200’a indirdi (bu uçta): enum tek başına güçlü bir yönlendiricidir ama garanti değildir; garanti Tier B’dedir.</w:t>
+        <w:t xml:space="preserve">yalnız enum (doğrulama kapalı) varlık ihlalini 23 / 200’den (%11.5) 0 / 200’e indirdi (bu uç noktada): enum tek başına güçlü bir yönlendiricidir, ancak decode-zamanı zorlama sağlayıcıya bağlı olduğu için garanti değildir; garanti Tier B’dedir.</w:t>
       </w:r>
     </w:p>
     <w:p>
@@ -9467,7 +10065,7 @@
                 <w:sz w:val="19"/>
                 <w:szCs w:val="19"/>
               </w:rPr>
-              <w:t xml:space="preserve">Kesinlik/güç beyanı: 0/200 = %1.88 Wilson üstü; H4-kritik hücreler N=200; N=100 hücreler betimsel</w:t>
+              <w:t xml:space="preserve">Kesinlik/güç beyanı: 0 / 200 gözlemi %1.88 Wilson üst sınırı bırakır; H4-kritik hücreler N=200; N=100 hücreler betimsel</w:t>
             </w:r>
           </w:p>
         </w:tc>
@@ -12964,6 +13562,140 @@
                 <w:sz w:val="19"/>
                 <w:szCs w:val="19"/>
               </w:rPr>
+              <w:t xml:space="preserve">k / N gösterimi</w:t>
+            </w:r>
+          </w:p>
+        </w:tc>
+        <w:tc>
+          <w:tcPr>
+            <w:tcW w:type="dxa" w:w="6426"/>
+            <w:tcBorders>
+              <w:top w:val="single" w:color="BFBFBF" w:sz="1"/>
+              <w:left w:val="single" w:color="BFBFBF" w:sz="1"/>
+              <w:bottom w:val="single" w:color="BFBFBF" w:sz="1"/>
+              <w:right w:val="single" w:color="BFBFBF" w:sz="1"/>
+            </w:tcBorders>
+            <w:tcMar>
+              <w:top w:type="dxa" w:w="60"/>
+              <w:left w:type="dxa" w:w="110"/>
+              <w:bottom w:type="dxa" w:w="60"/>
+              <w:right w:type="dxa" w:w="110"/>
+            </w:tcMar>
+          </w:tcPr>
+          <w:p>
+            <w:pPr>
+              <w:spacing w:after="0"/>
+            </w:pPr>
+            <w:r>
+              <w:rPr>
+                <w:b w:val="false"/>
+                <w:bCs w:val="false"/>
+                <w:sz w:val="19"/>
+                <w:szCs w:val="19"/>
+              </w:rPr>
+              <w:t xml:space="preserve">N yanıtlık hücrede k ihlal (pay/payda); 0 / 200 = 200 yanıtta sıfır ihlal gözlemi, kesin sıfır değil (bkz. 1.5)</w:t>
+            </w:r>
+          </w:p>
+        </w:tc>
+      </w:tr>
+      <w:tr>
+        <w:trPr>
+          <w:tblHeader w:val="false"/>
+        </w:trPr>
+        <w:tc>
+          <w:tcPr>
+            <w:tcW w:type="dxa" w:w="2600"/>
+            <w:tcBorders>
+              <w:top w:val="single" w:color="BFBFBF" w:sz="1"/>
+              <w:left w:val="single" w:color="BFBFBF" w:sz="1"/>
+              <w:bottom w:val="single" w:color="BFBFBF" w:sz="1"/>
+              <w:right w:val="single" w:color="BFBFBF" w:sz="1"/>
+            </w:tcBorders>
+            <w:tcMar>
+              <w:top w:type="dxa" w:w="60"/>
+              <w:left w:type="dxa" w:w="110"/>
+              <w:bottom w:type="dxa" w:w="60"/>
+              <w:right w:type="dxa" w:w="110"/>
+            </w:tcMar>
+          </w:tcPr>
+          <w:p>
+            <w:pPr>
+              <w:spacing w:after="0"/>
+            </w:pPr>
+            <w:r>
+              <w:rPr>
+                <w:b w:val="false"/>
+                <w:bCs w:val="false"/>
+                <w:sz w:val="19"/>
+                <w:szCs w:val="19"/>
+              </w:rPr>
+              <w:t xml:space="preserve">Hücre</w:t>
+            </w:r>
+          </w:p>
+        </w:tc>
+        <w:tc>
+          <w:tcPr>
+            <w:tcW w:type="dxa" w:w="6426"/>
+            <w:tcBorders>
+              <w:top w:val="single" w:color="BFBFBF" w:sz="1"/>
+              <w:left w:val="single" w:color="BFBFBF" w:sz="1"/>
+              <w:bottom w:val="single" w:color="BFBFBF" w:sz="1"/>
+              <w:right w:val="single" w:color="BFBFBF" w:sz="1"/>
+            </w:tcBorders>
+            <w:tcMar>
+              <w:top w:type="dxa" w:w="60"/>
+              <w:left w:type="dxa" w:w="110"/>
+              <w:bottom w:type="dxa" w:w="60"/>
+              <w:right w:type="dxa" w:w="110"/>
+            </w:tcMar>
+          </w:tcPr>
+          <w:p>
+            <w:pPr>
+              <w:spacing w:after="0"/>
+            </w:pPr>
+            <w:r>
+              <w:rPr>
+                <w:b w:val="false"/>
+                <w:bCs w:val="false"/>
+                <w:sz w:val="19"/>
+                <w:szCs w:val="19"/>
+              </w:rPr>
+              <w:t xml:space="preserve">(sağlayıcı, model, görev, kol, N, seed, kanıt-hash) yedilisiyle tanımlı ölçüm birimi; N bağımsız yanıt içerir</w:t>
+            </w:r>
+          </w:p>
+        </w:tc>
+      </w:tr>
+      <w:tr>
+        <w:trPr>
+          <w:tblHeader w:val="false"/>
+        </w:trPr>
+        <w:tc>
+          <w:tcPr>
+            <w:tcW w:type="dxa" w:w="2600"/>
+            <w:tcBorders>
+              <w:top w:val="single" w:color="BFBFBF" w:sz="1"/>
+              <w:left w:val="single" w:color="BFBFBF" w:sz="1"/>
+              <w:bottom w:val="single" w:color="BFBFBF" w:sz="1"/>
+              <w:right w:val="single" w:color="BFBFBF" w:sz="1"/>
+            </w:tcBorders>
+            <w:tcMar>
+              <w:top w:type="dxa" w:w="60"/>
+              <w:left w:type="dxa" w:w="110"/>
+              <w:bottom w:type="dxa" w:w="60"/>
+              <w:right w:type="dxa" w:w="110"/>
+            </w:tcMar>
+          </w:tcPr>
+          <w:p>
+            <w:pPr>
+              <w:spacing w:after="0"/>
+            </w:pPr>
+            <w:r>
+              <w:rPr>
+                <w:b w:val="false"/>
+                <w:bCs w:val="false"/>
+                <w:sz w:val="19"/>
+                <w:szCs w:val="19"/>
+              </w:rPr>
               <w:t xml:space="preserve">Wilson %95 GA</w:t>
             </w:r>
           </w:p>
@@ -12995,7 +13727,7 @@
                 <w:sz w:val="19"/>
                 <w:szCs w:val="19"/>
               </w:rPr>
-              <w:t xml:space="preserve">Oran için Wilson güven aralığı; 0/200 gözlem %1.88 üst sınır bırakır</w:t>
+              <w:t xml:space="preserve">Oran için Wilson skor güven aralığı; 0 / 200 gözlemi %1.88, 0 / 100 gözlemi %3.70 üst sınır bırakır</w:t>
             </w:r>
           </w:p>
         </w:tc>

</xml_diff>

<commit_message>
Documentation: N is a per-cell parameter, sweep N=100 made explicit
Reader question exposed a real gap: the June paraphrase sweep ran at
N=100 per variant (Run B in the 06-12 battery record) while battery
cells ran at N=200 per arm, and the doc implied a uniform 200. Fixed:
section 1.5 now states N is a cell parameter recorded in three places
(record header, JSONL filename, per-cell row count) and that rates are
always computed from each cell own N by make_tables.py, never typed by
hand. Section 6 intro and the sweep bullet now carry the actual N=100,
with the 1/100 to 100/100 spread written as k/N.
</commit_message>
<xml_diff>
--- a/docs/mlcompass_Teknik_Dokumantasyon.docx
+++ b/docs/mlcompass_Teknik_Dokumantasyon.docx
@@ -195,7 +195,7 @@
         <w:spacing w:after="120"/>
       </w:pPr>
       <w:r>
-        <w:t xml:space="preserve">Bu üç kanal, bu projenin ölçüm ve doğrulama nesnesidir. Haziran 2026 canlı ölçümlerinde çıplak (kural belirtilmemiş) bir anlatıcının sentetik görevde 200 bağımsız yanıtın 23-30’unda (%11.5-15.0), gerçek veri görevinde ise 87’sinde (%43.5) kanıt dışı sütun uydurduğu; üstelik aynı görevin altı farklı, kural içermeyen sistem-prompt parafrazı arasında bu oranın %1 ile %100 arasında oynadığı ölçüldü (ölçüm birimleri ve k / N gösterimi için bkz. bölüm 1.5). Yani problem gerçek, büyük ve prompt seçimine aşırı duyarlı.</w:t>
+        <w:t xml:space="preserve">Bu üç kanal, bu projenin ölçüm ve doğrulama nesnesidir. Haziran 2026 canlı ölçümlerinde çıplak (kural belirtilmemiş) bir anlatıcının sentetik görevde 200 bağımsız yanıtın 23-30’unda (%11.5-15.0), gerçek veri görevinde ise 87’sinde (%43.5) kanıt dışı sütun uydurduğu; üstelik aynı görevin altı farklı, kural içermeyen sistem-prompt parafrazı arasında bu oranın %1 ile %100 arasında oynadığı ölçüldü (varyant başına N = 100; ölçüm birimleri ve k / N gösterimi için bkz. bölüm 1.5). Yani problem gerçek, büyük ve prompt seçimine aşırı duyarlı.</w:t>
       </w:r>
     </w:p>
     <w:p>
@@ -351,7 +351,22 @@
         <w:t xml:space="preserve">k / N gösterimi: </w:t>
       </w:r>
       <w:r>
-        <w:t xml:space="preserve">hücrede örneklenen N bağımsız yanıtın k tanesinin ilgili kanalda ihlal içerdiği anlamına gelir; pay/payda ayracıdır, tek bir sayı değildir. Örnek: 0 / 200 = “200 yanıtın sıfırında ihlal gözlendi” (iki yüz yanıt; 2000 ile ilgisi yoktur). N, hücre başına örneklem büyüklüğüdür ve ön-kayıtta sabitlenir: çıkarımsal hücrelerde N=200, betimsel hücrelerde N=100 (A3.7).</w:t>
+        <w:t xml:space="preserve">hücrede örneklenen N bağımsız yanıtın k tanesinin ilgili kanalda ihlal içerdiği anlamına gelir; pay/payda ayracıdır, tek bir sayı değildir. Örnek: 0 / 200 = “200 yanıtın sıfırında ihlal gözlendi” (iki yüz yanıt; 2000 ile ilgisi yoktur). N sabit bir evrensel değil, HÜCRE PARAMETRESİDİR ve hücreden hücreye değişebilir; ön-kayıt çıkarımsal hücrelere N=200, betimsel hücrelere N=100 atar (A3.7). Bu yüzden tablolar daima k ile N’yi birlikte verir; yüzde, o hücrenin kendi N’inden MEKANİK olarak hesaplanır (R8 kuralı: tablolara elle yüzde yazmak yasaktır, make_tables.py hesaplar).</w:t>
+      </w:r>
+    </w:p>
+    <w:p>
+      <w:pPr>
+        <w:spacing w:after="120"/>
+      </w:pPr>
+      <w:r>
+        <w:rPr>
+          <w:b/>
+          <w:bCs/>
+        </w:rPr>
+        <w:t xml:space="preserve">N nerede kayıtlı? </w:t>
+      </w:r>
+      <w:r>
+        <w:t xml:space="preserve">Üç bağımsız yerde: (1) ölçüm kaydının başlığında (ör. “4 arms, N=200/arm”, “6 variants × N=100”), (2) JSONL koşu dosyasının adında (ör. deepseek_..._layer1_n200_seed0_e&lt;hash&gt;.jsonl), (3) hücrenin kayıt sayısında (satır sayısı = üretilen yanıt sayısı; taşıma hatası dışlamaları errors_excluded ile ayrıca raporlanır). N asla varsayılmaz; her tablo kendi kaynağının N’ini taşır.</w:t>
       </w:r>
     </w:p>
     <w:p>
@@ -6703,7 +6718,7 @@
         <w:spacing w:after="120"/>
       </w:pPr>
       <w:r>
-        <w:t xml:space="preserve">Kurulum: deepseek-chat uç noktası; hücre başına N = 200 bağımsız canlı yanıt (hücre tanımı ve k / N gösterimi için bkz. bölüm 1.5); ham kayıtlar paper/ablation_live_*.md dosyalarında. İki görev: sentetik çerçeve (monotone_log deseni) ve gerçek-veri Insurance görevi.</w:t>
+        <w:t xml:space="preserve">Kurulum: deepseek-chat uç noktası; ham kayıtlar paper/ablation_live_*.md dosyalarında. N hücre parametresidir ve her kaydın başlığında bellidir (bkz. 1.5): battery hücreleri (aşağıdaki tablo) kol başına N = 200 ile, parafraz sweep’i ise varyant başına N = 100 ile koşuldu. İki görev: sentetik çerçeve (monotone_log deseni) ve gerçek-veri Insurance görevi.</w:t>
       </w:r>
     </w:p>
     <w:tbl>
@@ -7552,10 +7567,10 @@
           <w:b/>
           <w:bCs/>
         </w:rPr>
-        <w:t xml:space="preserve">Parafraz sweep: </w:t>
-      </w:r>
-      <w:r>
-        <w:t xml:space="preserve">6 kural-içermeyen parafraz arasında entity-fab %1 ile %100 arasında; aynı model, aynı kanıt, aynı şema.</w:t>
+        <w:t xml:space="preserve">Parafraz sweep (varyant başına N = 100): </w:t>
+      </w:r>
+      <w:r>
+        <w:t xml:space="preserve">6 kural-içermeyen parafraz arasında entity-fab 1 / 100 (%1) ile 100 / 100 (%100) arasında; aynı model, aynı kanıt, aynı şema. Q1 replikasyonunda sweep sağlayıcıları ve N’ler ön-kayıtta sabitlendi.</w:t>
       </w:r>
     </w:p>
     <w:p>

</xml_diff>

<commit_message>
Documentation: full prose rewrite into technical register
Earlier revisions added technical artifacts (formulas, schema fragment,
pseudocode, sample records) but left the prose conversational. This
pass rewrites the running text itself: impersonal engineering register,
enumerated failure channels, invariant-style statements for the trust
boundary and Tier A/B composition, measured claims instead of
rhetorical ones (the paraphrase-instability finding is now stated as a
rejected invariance assumption), false-positive/false-negative framing
for the value tolerance, structural-equality wording for the crowded
instance construction, and normalized emphasis (no shouting caps, no
colloquialisms).
</commit_message>
<xml_diff>
--- a/docs/mlcompass_Teknik_Dokumantasyon.docx
+++ b/docs/mlcompass_Teknik_Dokumantasyon.docx
@@ -179,7 +179,7 @@
         <w:pStyle w:val="Heading2"/>
       </w:pPr>
       <w:r>
-        <w:t xml:space="preserve">1.1 Problem: LLM anlatımında kanıt uydurma</w:t>
+        <w:t xml:space="preserve">1.1 Problem tanımı: LLM anlatımında kanıt fabrikasyonu</w:t>
       </w:r>
     </w:p>
     <w:p>
@@ -187,7 +187,7 @@
         <w:spacing w:after="120"/>
       </w:pPr>
       <w:r>
-        <w:t xml:space="preserve">Büyük dil modelleri (LLM), makine öğrenmesi (ML) süreçlerinde giderek daha fazla “anlatıcı” olarak kullanılıyor: bir metrik şüpheli çıktığında, bir veri sızıntısı (data leakage) belirtisi görüldüğünde, modelden eldeki sayısal kanıtı yorumlaması ve kullanıcıya açıklaması isteniyor. Sorun şu ki modeller bu anlatım sırasında kanıtta OLMAYAN şeyler üretebiliyor: veri kümesinde bulunmayan sütun adları uyduruyor (entity fabrication), ölçülmüş bir korelasyonu yanlış rakamla aktarıyor (value fabrication) ya da kanıttaki en kritik bulguyu hiç anmadan hüküm veriyor (critical omission).</w:t>
+        <w:t xml:space="preserve">Büyük dil modelleri (LLM), ML boru hatlarının ürettiği sayısal kanıtın doğal-dil anlatımında artan sıklıkla görev almaktadır: şüpheli bir metrik veya veri sızıntısı (data leakage) sinyali oluştuğunda, deterministik dedektörün çıktısı modele verilir ve kullanıcıya yorumlanmış bir değerlendirme sunması beklenir. Bu anlatım katmanı üç ayrık hata kanalına açıktır: (i) varlık fabrikasyonu (entity fabrication): kanıt sözlüğünde bulunmayan sütun adlarına atıf; (ii) değer fabrikasyonu (value fabrication): ölçülmüş bir büyüklüğün yanlış sayısal değerle aktarımı; (iii) kritik eksik bırakma (critical omission): en yüksek öncelikli kanıt öğesine hiç değinmeden hüküm bildirme.</w:t>
       </w:r>
     </w:p>
     <w:p>
@@ -195,7 +195,7 @@
         <w:spacing w:after="120"/>
       </w:pPr>
       <w:r>
-        <w:t xml:space="preserve">Bu üç kanal, bu projenin ölçüm ve doğrulama nesnesidir. Haziran 2026 canlı ölçümlerinde çıplak (kural belirtilmemiş) bir anlatıcının sentetik görevde 200 bağımsız yanıtın 23-30’unda (%11.5-15.0), gerçek veri görevinde ise 87’sinde (%43.5) kanıt dışı sütun uydurduğu; üstelik aynı görevin altı farklı, kural içermeyen sistem-prompt parafrazı arasında bu oranın %1 ile %100 arasında oynadığı ölçüldü (varyant başına N = 100; ölçüm birimleri ve k / N gösterimi için bkz. bölüm 1.5). Yani problem gerçek, büyük ve prompt seçimine aşırı duyarlı.</w:t>
+        <w:t xml:space="preserve">Bu üç kanal, projenin ölçüm ve doğrulama nesnesini oluşturur. Haziran 2026 canlı ölçümlerinde, kural bildirilmemiş (bare-prompt) bir anlatıcı sentetik görevde 200 bağımsız yanıtın 23-30’unda (%11.5-15.0), gerçek-veri görevinde 87’sinde (%43.5) varlık fabrikasyonu üretmiştir; aynı görevin kural içermeyen altı sistem-prompt parafrazı arasında oran 1/100 ile 100/100 aralığında değişmiştir (varyant başına N = 100; hücre ve k/N gösterimi için bkz. 1.5). Ölçümler, fabrikasyonun (a) sıfırdan istatistiksel olarak ayrık, (b) görev-bağımlı ve (c) prompt parafrazına karşı yüksek varyanslı olduğunu göstermektedir; bu üçlü, çözümün prompt mühendisliğine devredilemeyeceğinin ampirik gerekçesidir.</w:t>
       </w:r>
     </w:p>
     <w:p>
@@ -211,7 +211,7 @@
         <w:spacing w:after="120"/>
       </w:pPr>
       <w:r>
-        <w:t xml:space="preserve">Önerilen çözüm, model çıktısını serbest metin yerine zorunlu bir araç çağrısına (tool call) yönlendirmek ve bu aracın JSON şemasını her çağrıda o anki kanıttan üretmektir. İki katman birlikte çalışır:</w:t>
+        <w:t xml:space="preserve">Önerilen mekanizma, anlatıcı çıktısını serbest metin yerine zorunlu bir araç çağrısına (forced tool call) yönlendirir ve aracın JSON şemasını her çağrıda o anki kanıt sözlüğünden türetir. İki katman bileşiktir:</w:t>
       </w:r>
     </w:p>
     <w:p>
@@ -231,7 +231,7 @@
         <w:t xml:space="preserve">Tier A (çağrı anı enum): </w:t>
       </w:r>
       <w:r>
-        <w:t xml:space="preserve">aracın “hangi sütunlara atıf yapabilirsin” alanları, kanıt sözlüğünden o an türetilen bir enum ile kısıtlanır. Şema statik değildir; kanıt neyse izin verilen değer kümesi odur.</w:t>
+        <w:t xml:space="preserve">sütun-değerli alanların (columns_referenced, claims[].column) değer uzayı, kanıt sözlüğünden çağrı anında türetilen bir enum ile kısıtlanır. Şema statik bir sabit değil, kanıtın bir fonksiyonudur.</w:t>
       </w:r>
     </w:p>
     <w:p>
@@ -248,10 +248,10 @@
           <w:b/>
           <w:bCs/>
         </w:rPr>
-        <w:t xml:space="preserve">Tier B (deterministik doğrulama): </w:t>
-      </w:r>
-      <w:r>
-        <w:t xml:space="preserve">model ne dönerse dönsün, yanıt üç kanalda kod ile yeniden doğrulanır (varlık, değer, tamlık). İhlalde model düzeltme mesajıyla yeniden denenir; bütçe biterse ihlalli parçalar silinir (strip) ya da silinemiyorsa bayraklanır (flag). Kullanıcıya kanıt dışı hiçbir şey ulaşmaz.</w:t>
+        <w:t xml:space="preserve">Tier B (deterministik yeniden-doğrulama): </w:t>
+      </w:r>
+      <w:r>
+        <w:t xml:space="preserve">sağlayıcı yanıtı, üç kanalda (varlık, değer, tamlık) istemci tarafında yeniden doğrulanır. İhlal halinde düzeltme mesajıyla sınırlı sayıda yeniden deneme yapılır; bütçe tükendiğinde ihlalli öğeler deterministik olarak çıkarılır (strip) veya çıkarımla onarılamıyorsa bayraklanır (flag). Kanıt-kapalı olmayan hiçbir öğe kullanıcı arayüzüne ulaşmaz.</w:t>
       </w:r>
     </w:p>
     <w:p>
@@ -259,7 +259,7 @@
         <w:spacing w:after="120"/>
       </w:pPr>
       <w:r>
-        <w:t xml:space="preserve">Kritik tasarım ilkesi: Tier B hiçbir sağlayıcının şema-uygulama (enforcement) davranışına güvenmez. Sağlayıcı enum’u decode sırasında zorlasa da zorlamasa da doğrulama bizim tarafımızda, deterministik olarak yapılır. Bu, çözümü sağlayıcıdan bağımsız kılar.</w:t>
+        <w:t xml:space="preserve">Tasarım değişmezi: Tier B, hiçbir sağlayıcının şema-uygulama (enforcement) davranışını varsaymaz. Enum’un decode sırasında zorlanıp zorlanmadığından bağımsız olarak doğrulama istemci tarafında deterministik biçimde yürütülür; garanti bu nedenle sağlayıcı-bağımsızdır.</w:t>
       </w:r>
     </w:p>
     <w:p>
@@ -351,7 +351,7 @@
         <w:t xml:space="preserve">k / N gösterimi: </w:t>
       </w:r>
       <w:r>
-        <w:t xml:space="preserve">hücrede örneklenen N bağımsız yanıtın k tanesinin ilgili kanalda ihlal içerdiği anlamına gelir; pay/payda ayracıdır, tek bir sayı değildir. Örnek: 0 / 200 = “200 yanıtın sıfırında ihlal gözlendi” (iki yüz yanıt; 2000 ile ilgisi yoktur). N sabit bir evrensel değil, HÜCRE PARAMETRESİDİR ve hücreden hücreye değişebilir; ön-kayıt çıkarımsal hücrelere N=200, betimsel hücrelere N=100 atar (A3.7). Bu yüzden tablolar daima k ile N’yi birlikte verir; yüzde, o hücrenin kendi N’inden MEKANİK olarak hesaplanır (R8 kuralı: tablolara elle yüzde yazmak yasaktır, make_tables.py hesaplar).</w:t>
+        <w:t xml:space="preserve">hücrede örneklenen N bağımsız yanıtın k tanesinin ilgili kanalda ihlal içerdiği anlamına gelir; pay/payda ayracıdır, tek bir sayı değildir. Örnek: 0 / 200 = “200 yanıtın sıfırında ihlal gözlendi” (iki yüz yanıt; 2000 ile ilgisi yoktur). N sabit bir evrensel büyüklük değil, hücre parametresidir ve hücreden hücreye değişebilir; ön-kayıt çıkarımsal hücrelere N=200, betimsel hücrelere N=100 atar (A3.7). Bu yüzden tablolar daima k ile N’yi birlikte verir; yüzde, o hücrenin kendi N’inden mekanik olarak hesaplanır (R8 kuralı: tablolara elle yüzde yazmak yasaktır, make_tables.py hesaplar).</w:t>
       </w:r>
     </w:p>
     <w:p>
@@ -381,7 +381,7 @@
         <w:t xml:space="preserve">Wilson %95 güven aralığı: </w:t>
       </w:r>
       <w:r>
-        <w:t xml:space="preserve">k / N oranının örnekleme belirsizliği Wilson skor aralığıyla verilir: merkez = (p̂ + z²/2N) / (1 + z²/N), yarı-genişlik = (z / (1 + z²/N)) · sqrt(p̂(1-p̂)/N + z²/4N²), z = 1.959964. Kritik sonuç: k = 0 gözlemi “kesin sıfır” kanıtı DEĞİLDİR; 0 / 200 gözlemi %1.88, 0 / 100 gözlemi %3.70 üst sınır bırakır. Bu yüzden makaledeki her sıfır iddiası hücre bazında Wilson üst sınırıyla birlikte raporlanır (A3.12).</w:t>
+        <w:t xml:space="preserve">k / N oranının örnekleme belirsizliği Wilson skor aralığıyla verilir: merkez = (p̂ + z²/2N) / (1 + z²/N), yarı-genişlik = (z / (1 + z²/N)) · sqrt(p̂(1-p̂)/N + z²/4N²), z = 1.959964. Kritik sonuç: k = 0 gözlemi “kesin sıfır” kanıtı değildir; 0 / 200 gözlemi %1.88, 0 / 100 gözlemi %3.70 üst sınır bırakır. Bu yüzden makaledeki her sıfır iddiası hücre bazında Wilson üst sınırıyla birlikte raporlanır (A3.12).</w:t>
       </w:r>
     </w:p>
     <w:p>
@@ -405,7 +405,7 @@
         <w:spacing w:after="120"/>
       </w:pPr>
       <w:r>
-        <w:t xml:space="preserve">mlcompass, “ML süreçlerinin pusulası” olarak tasarlanmış bir Python paketidir: veri kümesinden dağıtıma kadar her adımda deterministik analiz + isteğe bağlı LLM yorumu sunar. Şubat-Haziran 2026 arasında 10 faz halinde geliştirildi (v0.1.0’dan v0.9.0’a). Kurulum:</w:t>
+        <w:t xml:space="preserve">mlcompass, ML iş akışının veri-kümesi analizi ile dağıtım-hazırlık kontrolü arasındaki adımlarını kapsayan bir Python paketidir. Her komut iki katmandan oluşur: deterministik bir analiz çekirdeği (saf fonksiyonlar; API çağrısı yok) ve isteğe bağlı bir LLM yorum katmanı (--llm). Şubat-Haziran 2026 arasında 10 fazda geliştirilmiştir (v0.1.0’dan v0.9.0’a). Kurulum:</w:t>
       </w:r>
     </w:p>
     <w:p>
@@ -1878,7 +1878,7 @@
         <w:t xml:space="preserve">src/mlcompass/tools/leakage.py</w:t>
       </w:r>
       <w:r>
-        <w:t xml:space="preserve">. Değerlendirme sırasında “sızıntı kokusu” eşiği tetiklenirse (AUC &gt; 0.995, doğruluk &gt; 0.99 veya R² &gt; 0.999, en az 50 satırda) devreye girer. Gözlemseldir; suçlamaz, kanıt toplar:</w:t>
+        <w:t xml:space="preserve">. Değerlendirme sırasında sızıntı-şüphesi eşiği aşıldığında tetiklenir (AUC &gt; 0.995, doğruluk &gt; 0.99 veya R² &gt; 0.999; en az 50 satır koşuluyla). Katman gözlemseldir: hüküm üretmez, yapılandırılmış kanıt toplar:</w:t>
       </w:r>
     </w:p>
     <w:p>
@@ -1969,7 +1969,7 @@
         <w:pStyle w:val="Heading2"/>
       </w:pPr>
       <w:r>
-        <w:t xml:space="preserve">3.1 Güven sınırı kavramı</w:t>
+        <w:t xml:space="preserve">3.1 Güven sınırı</w:t>
       </w:r>
     </w:p>
     <w:p>
@@ -1977,7 +1977,7 @@
         <w:spacing w:after="120"/>
       </w:pPr>
       <w:r>
-        <w:t xml:space="preserve">Mimarinin tek cümlelik özeti: “Hiçbir şey kontrolsüz geçmez.” LLM, güven sınırının dışındadır; kullanıcıya giden her alan ya çağrı anında kısıtlanmış şemadan gelir (Tier A) ya da deterministik doğrulamadan geçer (Tier B). Anlatıcı model yalnızca öneri üretir; neyin geçeceğine kod karar verir.</w:t>
+        <w:t xml:space="preserve">Mimari değişmez (invariant): kullanıcıya ulaşan her alan, ya çağrı anında kısıtlanmış şemadan geçmiştir (Tier A) ya da deterministik yeniden-doğrulamadan (Tier B); iki yoldan en az biri her alan için zorunludur. LLM güven sınırının dışında konumlanır: rolü aday çıktı üretmektir, kabul kararı tamamen istemci kodundadır. Bu ayrım, anlatıcı modelin yetenek veya hizalama varsayımlarını garanti zincirinden çıkarır.</w:t>
       </w:r>
     </w:p>
     <w:p>
@@ -2481,7 +2481,7 @@
                 <w:sz w:val="19"/>
                 <w:szCs w:val="19"/>
               </w:rPr>
-              <w:t xml:space="preserve">Retry; bütçe biterse ihlalli adlar SİLİNİR (strip)</w:t>
+              <w:t xml:space="preserve">Retry; bütçe biterse ihlalli adlar silinir (strip)</w:t>
             </w:r>
           </w:p>
         </w:tc>
@@ -2579,7 +2579,7 @@
                 <w:sz w:val="19"/>
                 <w:szCs w:val="19"/>
               </w:rPr>
-              <w:t xml:space="preserve">Retry; bütçe biterse iddia SİLİNİR</w:t>
+              <w:t xml:space="preserve">Retry; bütçe biterse iddia silinir</w:t>
             </w:r>
           </w:p>
         </w:tc>
@@ -2677,7 +2677,7 @@
                 <w:sz w:val="19"/>
                 <w:szCs w:val="19"/>
               </w:rPr>
-              <w:t xml:space="preserve">Retry; silinerek onarılamaz, kalıcıysa BAYRAKLANIR (omitted_critical_evidence=true)</w:t>
+              <w:t xml:space="preserve">Retry; silinerek onarılamaz, kalıcıysa bayraklanır (omitted_critical_evidence=true)</w:t>
             </w:r>
           </w:p>
         </w:tc>
@@ -2696,7 +2696,7 @@
         <w:spacing w:after="120"/>
       </w:pPr>
       <w:r>
-        <w:t xml:space="preserve">Değer kanalındaki 0.005 toleransı bilinçli bir dengedir: dürüst yuvarlama (0.9512’yi 0.95 diye aktarmak) fabrikasyon sayılmaz; 1.00 ölçülmüşken 0.85 demek sayılır.</w:t>
+        <w:t xml:space="preserve">Değer kanalındaki ±0.005 toleransı, yanlış-pozitif/yanlış-negatif dengesini şu kritere göre sabitler: iki ondalığa dürüst yuvarlama (0.9512 → “0.95”) ihlal sayılmaz; ölçülen 1.00 için 0.85 bildirmek ihlaldir. Tolerans değeri kontrat spesifikasyonunun parçasıdır ve bağımsız skorlayıcıda ayrıca yeniden beyan edilir (bkz. 4.5).</w:t>
       </w:r>
     </w:p>
     <w:p>
@@ -3750,7 +3750,7 @@
         <w:t xml:space="preserve">scripts/reproduce_hallucination_ablation.py</w:t>
       </w:r>
       <w:r>
-        <w:t xml:space="preserve">. Tüm canlı ölçümlerin tek giriş noktasıdır; mock modu yalnızca gösterimliktir (ölçüm DEĞİLDİR, geçmiş oranları tekrar oynatır ve bunu ekranda söyler).</w:t>
+        <w:t xml:space="preserve">. Tüm canlı ölçümlerin tek giriş noktasıdır. Mock modu ölçüm üretmez: geçmiş bir koşunun oranlarını simülasyonla yeniden oynatır ve çıktı başlığında bunu açıkça bildirir; Tablo-1 sınıfı her sonuç yalnızca --mode live kayıtlarından türetilebilir.</w:t>
       </w:r>
     </w:p>
     <w:p>
@@ -4393,7 +4393,7 @@
         <w:spacing w:after="120"/>
       </w:pPr>
       <w:r>
-        <w:t xml:space="preserve">Aynı görev, aynı kanıt, aynı açık araç; yalnızca kural içermeyen sistem prompt’u 6 varyasyonla değiştirilir. Haziran bulgusu: entity-fabrikasyon oranı parafrazlar arasında yüzde 1 ile yüzde 100 arasında oynadı. Bu, “prompt mühendisliği yeter” savını doğrudan hedefleyen manşet bulgudur ve Q1’de en az 2 sağlayıcıda replike edilecektir (R5).</w:t>
+        <w:t xml:space="preserve">Aynı görev, aynı kanıt, aynı açık araç; yalnızca kural içermeyen sistem prompt’u altı varyasyonla değiştirilir. Haziran gözlemi: varlık-fabrikasyon oranı parafrazlar arasında 1/100 ile 100/100 aralığında değişti. Bu bulgu, prompt-yalnız çözümlerin örtük kararlılık varsayımını (parafraz-değişmezliği) doğrudan test eder ve reddeder; en az iki sağlayıcıda replikasyonu ön-kayıtlıdır (R5).</w:t>
       </w:r>
     </w:p>
     <w:p>
@@ -4859,7 +4859,7 @@
                 <w:sz w:val="19"/>
                 <w:szCs w:val="19"/>
               </w:rPr>
-              <w:t xml:space="preserve">Her ödenmiş yanıt geldiği anda JSONL’e yazılır (crash/Ctrl-C para kaybettirmez)</w:t>
+              <w:t xml:space="preserve">Her ödenmiş yanıt alınır alınmaz JSONL’e append+flush edilir; işlem kesintisi (crash/SIGINT) veri kaybına yol açmaz</w:t>
             </w:r>
           </w:p>
         </w:tc>
@@ -4934,7 +4934,7 @@
                 <w:sz w:val="19"/>
                 <w:szCs w:val="19"/>
               </w:rPr>
-              <w:t xml:space="preserve">Kesilen koşu kaldığı kayıttan devam eder; kırık kuyruk (yarım satır) onarılır, tekrar satın alma olmaz</w:t>
+              <w:t xml:space="preserve">Kesilen koşu son geçerli kayıttan devam eder; kesinti anındaki yarım satır (kırık kuyruk) ilk append’den önce onarılır, mükerrer ücretlendirme oluşmaz</w:t>
             </w:r>
           </w:p>
         </w:tc>
@@ -5239,7 +5239,7 @@
         <w:t xml:space="preserve">scripts/independent_scorer.py</w:t>
       </w:r>
       <w:r>
-        <w:t xml:space="preserve"> (A3.9a). Üç kanalı ham JSONL + kanıt sözlüğünden, üründen ve harness’ten HİÇBİR yardımcı import etmeden yeniden hesaplar (tolerans 0.005 dahil her kural bağımsızca yeniden yazılmıştır). Loglardaki satır-içi skorlarla uyuşmazlık sayısını raporlar: makalede “skorlayıcı mutabakatı” istatistiği budur. Makale tabloları YALNIZCA bu skorlayıcıdan üretilir.</w:t>
+        <w:t xml:space="preserve"> (A3.9a). Üç kanalı ham JSONL + kanıt sözlüğünden, üründen ve harness’ten hiçbir yardımcı import etmeden yeniden hesaplar (tolerans 0.005 dahil her kural bağımsızca yeniden yazılmıştır). Loglardaki satır-içi skorlarla uyuşmazlık sayısını raporlar: makalede “skorlayıcı mutabakatı” istatistiği budur. Makale tabloları yalnızca bu skorlayıcıdan üretilir.</w:t>
       </w:r>
     </w:p>
     <w:p>
@@ -5274,7 +5274,7 @@
         <w:spacing w:after="120"/>
       </w:pPr>
       <w:r>
-        <w:t xml:space="preserve">Harness 9 sağlayıcıyı tek arayüzle destekler: anthropic, openai, deepseek, gemini, mistral, xai, qwen, groq, vllm. Anahtarlar YALNIZCA ortam değişkeninden okunur (koda ve sohbete anahtar girmez). DeepSeek için model adı deepseek-v4-flash pinlidir (deepseek-chat takma adı 24 Temmuz 2026’da kapanıyor; replikasyon koşuları o tarihten sonra da çalışsın diye).</w:t>
+        <w:t xml:space="preserve">Harness dokuz sağlayıcıyı tek arayüz üzerinden destekler: anthropic, openai, deepseek, gemini, mistral, xai, qwen, groq, vllm. API anahtarları yalnızca ortam değişkenlerinden okunur; kaynak koda, komut geçmişine ve konuşma kanallarına anahtar yazılmaz. DeepSeek varsayılan modeli deepseek-v4-flash olarak pinlidir: deepseek-chat takma adı 24 Temmuz 2026’da servis dışı kalacağından, replikasyon komutlarının bu tarihten sonra da birebir çalışması ancak doğrudan model adıyla mümkündür.</w:t>
       </w:r>
     </w:p>
     <w:p>
@@ -5772,7 +5772,7 @@
         <w:spacing w:after="120"/>
       </w:pPr>
       <w:r>
-        <w:t xml:space="preserve">Her enjektör, gerçek bir tahmin çerçevesine TEK kontrollü sızıntı deseni eker ve (contamination hariç) eklediği sütunun adını (çapa) döndürür. Kanıt daima ürünün kendi dedektöründen üretilir. Desenler altı ayrı MEKANİZMayı örter, tek sızıntının altı çeşnisini değil:</w:t>
+        <w:t xml:space="preserve">Her enjektör, gerçek bir tahmin çerçevesine tek bir kontrollü sızıntı deseni ekler ve (contamination hariç) eklediği sütunun adını (çapa) döndürür; kanıt her durumda ürünün kendi dedektöründen üretilir. Altı desen, altı ayrık sızıntı mekanizmasını kapsayacak şekilde seçilmiştir; aynı mekanizmanın altı parametrizasyonu değildir:</w:t>
       </w:r>
     </w:p>
     <w:tbl>
@@ -6587,10 +6587,10 @@
           <w:b/>
           <w:bCs/>
         </w:rPr>
-        <w:t xml:space="preserve">Önemli (A3.10): </w:t>
-      </w:r>
-      <w:r>
-        <w:t xml:space="preserve">Haziran koşularında enjekte sütunlar *_leak son ekiyle adlandırılmıştı; bu, anlatıcıya cevabı fısıldayan bir belirginlik (salience) karışıklığıdır. Kampanya öncesi tüm adlar veri-kümesine-makul NÖTR adlara taşındı (yukarıdaki tabloda); tarihsel adlandırma makalede Threats to Validity altında açıklanacaktır. Ek olarak bir takma-adlandırma kolu vardır: --pseudonymize tüm sütun adlarını col_&lt;sha256[:8]&gt; ile maskeler (veri-kümesi aşinalığı karışıklığını doğrudan ölçmek için).</w:t>
+        <w:t xml:space="preserve">Adlandırma düzeltmesi (A3.10): </w:t>
+      </w:r>
+      <w:r>
+        <w:t xml:space="preserve">Haziran koşularında enjekte sütunlar *_leak son ekiyle adlandırılmıştı; bu adlandırma, doğru cevabı sözcüksel düzeyde kodlayan bir belirginlik (salience) karıştırıcısıdır ve ölçülen oranı sistematik biçimde etkileyebilir. Kampanya öncesinde tüm çapa adları veri-kümesine-makul nötr adlara taşınmıştır (yukarıdaki tablo); tarihsel adlandırma makalede Threats to Validity altında raporlanacaktır. Ayrıca veri-kümesi aşinalığı karıştırıcısını doğrudan ölçmek için bir takma-adlandırma kolu tanımlıdır: --pseudonymize, tüm sütun adlarını içerik-hash’leriyle (col_&lt;sha256[:8]&gt;) değiştirir.</w:t>
       </w:r>
     </w:p>
     <w:p>
@@ -6640,7 +6640,7 @@
         <w:t xml:space="preserve"> (#14, değer-kanalı stresörü): </w:t>
       </w:r>
       <w:r>
-        <w:t xml:space="preserve">n=1200, seed 0; çapa sensor_ref tam 0.995 korelasyonla tek aday; dokuz kalabalık öznitelik sensor_00..sensor_08 TAM 0.900, 0.903, ..., 0.924 grid’inde (0.003 aralık). Örneklem korelasyonları Gram-Schmidt inşasıyla BİREBİR bu değerlere oturur (şans değil, yapı): hedef standartlaştırılır, her gürültü vektörü örneklem içinde hedefe dik hale getirilir ve x = r·z + sqrt(1-r²)·u karışımı kurulur. Birbirine bu kadar yakın değerler, düzyazıdan sayı aktaran anlatıcı için hata tuzağıdır; varlık kanalı ise etkilenmez. fetch --verify, grid’i 1e-6 hassasiyetle doğrular.</w:t>
+        <w:t xml:space="preserve">n=1200, seed 0; çapa sensor_ref 0.995 korelasyonla tek aday; dokuz kalabalık öznitelik sensor_00..sensor_08, 0.003 adımlı 0.900-0.924 grid’i üzerindedir. Örneklem Pearson korelasyonları bu grid değerlerine tam eşittir; eşitlik stokastik yakınsama değil, yapısal sonuçtur: hedef örneklem-içi standartlaştırılır, her gürültü vektörü hedefe örneklem-içi Gram-Schmidt ile dikleştirilir ve öznitelik x = r·z + sqrt(1-r²)·u karışımı olarak kurulur (bu inşada corr(x, y) = r, kayan-nokta hassasiyetinde). 0.003 aralıklı komşu değerler, serbest metinden sayı aktaran anlatıcı için sütun-değer karıştırma olasılığını maksimize eder; varlık kanalının değer uzayı ise değişmez, dolayısıyla iki kanal ayrışık ölçülür. fetch --verify, grid üyeliğini ve aralıkları 1e-6 toleransla doğrular.</w:t>
       </w:r>
     </w:p>
     <w:p>
@@ -6702,7 +6702,7 @@
         <w:spacing w:after="120"/>
       </w:pPr>
       <w:r>
-        <w:t xml:space="preserve">Her iki vaka da fetch --verify-cases ile ön-beyanlı beklentilere karşı doğrulanır: bodyfat Density’de ateşlemek, sambanis sessiz kalmak ZORUNDADIR.</w:t>
+        <w:t xml:space="preserve">Her iki vaka, fetch --verify-cases ile ön-beyanlı beklentilere karşı doğrulanır ve beklentiler kabul kriteridir: bodyfat’in Density üzerinde tetiklenmesi, sambanis’in aday üretmemesi gerekir; aksi durum doğrulama hatası olarak raporlanır.</w:t>
       </w:r>
     </w:p>
     <w:p>
@@ -7625,7 +7625,7 @@
         <w:t xml:space="preserve">Önemli ölçüm notu (A3.1): </w:t>
       </w:r>
       <w:r>
-        <w:t xml:space="preserve">L3 hücrelerindeki varlık/değer sıfırları ANALİTİKTİR: strip semantiği gereği yapısal olarak sıfırdır; model davranışının değil doğrulayıcı doğruluğunun kanıtıdır (test paketi + bağımsız skorlayıcı ile desteklenir). Ampirik olarak anlamlı karşılaştırma, L1 ile STRESS’in ilk-deneme yakalama oranlarıdır. Q1 tablolarında analitik hücreler ayrıca etiketlenecektir. Ayrıca her iki Haziran L1 sentetik ölçümü (%15.0 ve %11.5) makalede birlikte raporlanacaktır (A3.12); eski, doğrulanamayan bir ölçüm seti (8.0/1.0/0.0) silinmiştir ve HİÇBİR yerde kullanılmaz.</w:t>
+        <w:t xml:space="preserve">L3 hücrelerindeki varlık/değer sıfırları analitiktir: strip semantiği gereği yapısal olarak sıfırdır; model davranışının değil doğrulayıcı doğruluğunun kanıtıdır (test paketi + bağımsız skorlayıcı ile desteklenir). Ampirik olarak anlamlı karşılaştırma, L1 ile STRESS’in ilk-deneme yakalama oranlarıdır. Q1 tablolarında analitik hücreler ayrıca etiketlenecektir. Ayrıca her iki Haziran L1 sentetik ölçümü (%15.0 ve %11.5) makalede birlikte raporlanacaktır (A3.12); eski, doğrulanamayan bir ölçüm seti (8.0/1.0/0.0) silinmiştir ve hiçbir raporda kullanılmaz.</w:t>
       </w:r>
     </w:p>
     <w:p>
@@ -9000,7 +9000,7 @@
         <w:spacing w:after="120"/>
       </w:pPr>
       <w:r>
-        <w:t xml:space="preserve">Beş kapılı (gate) faz planı: Faz 1 katmanlı sağlayıcı paneli (battery + sweep), Faz 2 FabBench çekirdeği (enjektör x veri kümesi matrisi), Faz 3 baseline’lar + displacement, Faz 4 FabBench paketleme + mlcompass v1.0, Faz 5 manuskript + iki iç panel + gönderim. Bütçe hedefi 250 doların altı; gönderim hedefi Kasım-Aralık 2026; ilk karar 2-5 ay, major revision normal kabul edilir. Kullanıcı kuralı: API anahtarları yalnızca ortam değişkeni; sohbete ve commit’e ASLA anahtar girmez.</w:t>
+        <w:t xml:space="preserve">Beş kapılı (gate) faz planı: Faz 1 katmanlı sağlayıcı paneli (battery + sweep), Faz 2 FabBench çekirdeği (enjektör x veri kümesi matrisi), Faz 3 baseline’lar + displacement, Faz 4 FabBench paketleme + mlcompass v1.0, Faz 5 manuskript + iki iç panel + gönderim. Bütçe hedefi 250 ABD dolarının altıdır; gönderim hedefi Kasım-Aralık 2026’dır; ilk hakem kararı için 2-5 aylık süre ve major revision olağan senaryo kabul edilir. Operasyonel güvenlik kuralı: API anahtarları yalnızca ortam değişkenlerinde tutulur; konuşma kanallarına ve sürüm geçmişine anahtar yazılmaz.</w:t>
       </w:r>
     </w:p>
     <w:p>
@@ -10450,7 +10450,7 @@
         <w:spacing w:after="120"/>
       </w:pPr>
       <w:r>
-        <w:t xml:space="preserve">Paralı koşulara başlamadan önce, repo-temelli üç bağımsız hakem ajan çalıştırıldı (metodoloji hakemi, alan hakemi, düşman-artefakt hakemi); rapor paper/review_panel_2026-07-07.md dosyasındadır. Ana bulgular: Fisher L1-L3 testinin analitik sıfırlar yüzünden vakum olması; H5’te “ikinci şans” ile “ihlalin adlandırılması”nın ayrışmaması; *_leak adlarının cevabı ele vermesi; taşıma hatalarının temiz veri gibi skorlanması; hash pinlemenin yalnızca ekrana yazılması; bodyfat’ta el-kodlu formül. Bulguların TAMAMI, A3 amendment paketi (ön-kayıt) ve üç kod dalgası olarak işlendi.</w:t>
+        <w:t xml:space="preserve">Paralı koşulara başlamadan önce, repo-temelli üç bağımsız hakem ajan çalıştırıldı (metodoloji hakemi, alan hakemi, düşman-artefakt hakemi); rapor paper/review_panel_2026-07-07.md dosyasındadır. Ana bulgular: Fisher L1-L3 testinin analitik sıfırlar yüzünden vakum olması; H5’te “ikinci şans” ile “ihlalin adlandırılması”nın ayrışmaması; *_leak adlarının cevabı ele vermesi; taşıma hatalarının temiz veri gibi skorlanması; hash pinlemenin yalnızca ekrana yazılması; bodyfat’ta el-kodlu formül. Bulguların tamamı, A3 amendment paketi (ön-kayıt) ve üç kod dalgası olarak işlendi.</w:t>
       </w:r>
     </w:p>
     <w:p>
@@ -10966,7 +10966,7 @@
         <w:spacing w:after="60"/>
       </w:pPr>
       <w:r>
-        <w:t xml:space="preserve">Görev #101 (panel-onarım kod dalgası) TAMAM; paralı koşuların önündeki tek engel API kredileri (kullanıcı aksiyonu).</w:t>
+        <w:t xml:space="preserve">Görev #101 (panel-onarım kod dalgası) tamamlanmıştır; paralı koşuların önündeki tek engel API kredileri (kullanıcı aksiyonu).</w:t>
       </w:r>
     </w:p>
     <w:p>

</xml_diff>